<commit_message>
fix(feature_selection): address premature convergence in PSO through periodic mutation and partial population reinitialization
</commit_message>
<xml_diff>
--- a/DeCuongChiTiet_FeatureSelection_NIDS.docx
+++ b/DeCuongChiTiet_FeatureSelection_NIDS.docx
@@ -1012,7 +1012,7 @@
           </w:tcPr>
           <w:p>
             <w:r>
-              <w:t>Chuyên biệt tấn công DDoS (11-13 biến thể: SYN, UDP, DNS, LDAP, MSSQL, NTP, NetBIOS, SNMP, SSDP, TFTP, UDP-Lag, Portmap, WebDDoS), do CIC/UNB tạo cùng công cụ CICFlowMeter với CICIDS2017; dữ liệu train/test tách theo NGÀY thu thập khác nhau (loại tấn công ở ngày test có phần khác ngày train)</w:t>
+              <w:t>Chuyên biệt tấn công DDoS (bản Kaggle dhoogla/cicddos2019: mỗi loại tấn công có file train/test riêng), do CIC/UNB tạo cùng công cụ CICFlowMeter với CICIDS2017; LƯU Ý: tập train và test của bản này KHÔNG đối xứng về loại tấn công (train: LDAP, MSSQL, NetBIOS, Portmap, Syn, UDP, UDPLag; test: thêm DNS, NTP, SNMP, TFTP nhưng không có Portmap) - tận dụng như một phép đánh giá khả năng tổng quát hóa sang loại tấn công chưa từng thấy trong lúc huấn luyện</w:t>
             </w:r>
           </w:p>
         </w:tc>
@@ -1029,7 +1029,7 @@
           </w:tcPr>
           <w:p>
             <w:r>
-              <w:t>Đánh giá chuyên sâu khả năng phát hiện DDoS và tổng quát hóa qua các ngày thu thập khác nhau</w:t>
+              <w:t>Đánh giá khả năng tổng quát hóa khi gặp loại tấn công DDoS chưa từng thấy ở lúc huấn luyện</w:t>
             </w:r>
           </w:p>
         </w:tc>
@@ -1046,7 +1046,7 @@
           </w:tcPr>
           <w:p>
             <w:r>
-              <w:t>~80-88</w:t>
+              <w:t>68 (sau khi loại cột định danh + phương sai gần-0)</w:t>
             </w:r>
           </w:p>
         </w:tc>
@@ -1486,7 +1486,7 @@
         <w:spacing w:after="100" w:line="300"/>
       </w:pPr>
       <w:r>
-        <w:t>Chia tập train/validation/test (ví dụ 70/15/15) cho CICIDS2017 và UNSW-NB15; riêng CICDDoS2019 tận dụng cấu trúc chia theo ngày có sẵn (ngày 1 dùng huấn luyện, ngày 2 - hoặc ngược lại - dùng kiểm tra) để đánh giá khả năng tổng quát hóa khi loại tấn công ở tập test có phần khác tập train.</w:t>
+        <w:t>Chia tập train/validation/test (ví dụ 70/15/15) cho CICIDS2017 và UNSW-NB15; riêng CICDDoS2019 dùng cấu trúc train/test có sẵn theo TỪNG LOẠI TẤN CÔNG (bản Kaggle dhoogla/cicddos2019) - lưu ý tập train và test không đối xứng về loại tấn công (một số loại chỉ xuất hiện ở test, không có ở train), được tận dụng như một phép đánh giá khả năng tổng quát hóa sang tấn công chưa từng thấy.</w:t>
       </w:r>
     </w:p>
     <w:p>
@@ -5932,12 +5932,7 @@
         <w:spacing w:after="100" w:line="300"/>
       </w:pPr>
       <w:r>
-        <w:rPr>
-          <w:rFonts w:ascii="Times New Roman" w:cs="Times New Roman" w:eastAsia="Times New Roman" w:hAnsi="Times New Roman"/>
-          <w:sz w:val="24"/>
-          <w:szCs w:val="24"/>
-        </w:rPr>
-        <w:t xml:space="preserve">Khắc phục hiện tượng hội tụ sớm của PSO (mục 12.2) bằng các cơ chế duy trì đa dạng quần thể đã đề xuất, chạy lại trên cả 3 bộ dữ liệu để có số liệu PSO đáng tin cậy hơn.</w:t>
+        <w:t>Khắc phục hiện tượng hội tụ sớm của PSO (mục 12.2) - vẫn CHƯA xử lý, đã xác nhận lặp lại ở tất cả các lần chạy kể cả CICDDoS2019 (xem mục 12.4).</w:t>
       </w:r>
     </w:p>
     <w:p>
@@ -5950,12 +5945,7 @@
         <w:spacing w:after="100" w:line="300"/>
       </w:pPr>
       <w:r>
-        <w:rPr>
-          <w:rFonts w:ascii="Times New Roman" w:cs="Times New Roman" w:eastAsia="Times New Roman" w:hAnsi="Times New Roman"/>
-          <w:sz w:val="24"/>
-          <w:szCs w:val="24"/>
-        </w:rPr>
-        <w:t xml:space="preserve">Tiến hành cài đặt phương pháp Hybrid Feature Selection (Filter + GA/PSO) - đóng góp chính của đề tài.</w:t>
+        <w:t>Hoàn chỉnh Hybrid 1 (Filter + GA/PSO với hàm fitness cải tiến, kết hợp trực tiếp trong vòng lặp tối ưu) - hiện mới có Filter (MI) và Hybrid 2 (MI+SHAP+XGBoost) chạy độc lập, chưa ghép Filter làm bước tiền xử lý trước GA/PSO.</w:t>
       </w:r>
     </w:p>
     <w:p>
@@ -5968,12 +5958,7 @@
         <w:spacing w:after="100" w:line="300"/>
       </w:pPr>
       <w:r>
-        <w:rPr>
-          <w:rFonts w:ascii="Times New Roman" w:cs="Times New Roman" w:eastAsia="Times New Roman" w:hAnsi="Times New Roman"/>
-          <w:sz w:val="24"/>
-          <w:szCs w:val="24"/>
-        </w:rPr>
-        <w:t xml:space="preserve">Chạy thử nghiệm với --label-mode multi (phân loại đa lớp theo từng loại tấn công cụ thể) để đánh giá đầy đủ hơn khả năng của mô hình, thay vì chỉ dừng ở phân loại nhị phân.</w:t>
+        <w:t>Chạy thử nghiệm với --label-mode multi (phân loại đa lớp theo từng loại tấn công cụ thể) để đánh giá đầy đủ hơn khả năng của mô hình, thay vì chỉ dừng ở phân loại nhị phân.</w:t>
       </w:r>
     </w:p>
     <w:p>
@@ -5986,17 +5971,1595 @@
         <w:spacing w:after="100" w:line="300"/>
       </w:pPr>
       <w:r>
-        <w:rPr>
-          <w:rFonts w:ascii="Times New Roman" w:cs="Times New Roman" w:eastAsia="Times New Roman" w:hAnsi="Times New Roman"/>
-          <w:sz w:val="24"/>
-          <w:szCs w:val="24"/>
-        </w:rPr>
-        <w:t xml:space="preserve">Mở rộng đánh giá sang các bộ phân loại khác (Random Forest, XGBoost) ngoài Decision Tree để có bức tranh so sánh đầy đủ hơn.</w:t>
+        <w:t>Mở rộng đánh giá sang các bộ phân loại khác (Random Forest, XGBoost làm classifier chính) ngoài Decision Tree để có bức tranh so sánh đầy đủ hơn.</w:t>
       </w:r>
     </w:p>
     <w:p>
       <w:r>
         <w:br w:type="page"/>
+      </w:r>
+    </w:p>
+    <w:p>
+      <w:pPr>
+        <w:pStyle w:val="Heading2"/>
+      </w:pPr>
+      <w:r>
+        <w:rPr>
+          <w:rFonts w:ascii="Times New Roman" w:hAnsi="Times New Roman"/>
+          <w:b/>
+          <w:sz w:val="25"/>
+        </w:rPr>
+        <w:t>12.4. Kết quả đầy đủ: 5 kịch bản × 3 bộ dữ liệu (CICIDS2017, UNSW-NB15, CICDDoS2019)</w:t>
+      </w:r>
+    </w:p>
+    <w:p>
+      <w:pPr>
+        <w:jc w:val="both"/>
+      </w:pPr>
+      <w:r>
+        <w:rPr>
+          <w:rFonts w:ascii="Times New Roman" w:hAnsi="Times New Roman"/>
+          <w:sz w:val="24"/>
+        </w:rPr>
+        <w:t>Sau khi hoàn thiện pipeline CICDDoS2019 và 2 phương pháp mới (Filter-MI, Hybrid 2: MI+SHAP+XGBoost), lần đầu tiên có đủ số liệu cho cả 5 kịch bản thực nghiệm (mục 6.6) trên cả 3 bộ dữ liệu hiện hành của đề tài. Classifier dùng để đánh giá cuối: Decision Tree.</w:t>
+      </w:r>
+    </w:p>
+    <w:tbl>
+      <w:tblPr>
+        <w:tblW w:type="auto" w:w="0"/>
+        <w:tblLook w:firstColumn="1" w:firstRow="1" w:lastColumn="0" w:lastRow="0" w:noHBand="0" w:noVBand="1" w:val="04A0"/>
+        <w:tblBorders>
+          <w:top w:val="single" w:sz="4" w:space="0" w:color="999999"/>
+          <w:left w:val="single" w:sz="4" w:space="0" w:color="999999"/>
+          <w:bottom w:val="single" w:sz="4" w:space="0" w:color="999999"/>
+          <w:right w:val="single" w:sz="4" w:space="0" w:color="999999"/>
+          <w:insideH w:val="single" w:sz="4" w:space="0" w:color="999999"/>
+          <w:insideV w:val="single" w:sz="4" w:space="0" w:color="999999"/>
+        </w:tblBorders>
+      </w:tblPr>
+      <w:tblGrid>
+        <w:gridCol w:w="1504"/>
+        <w:gridCol w:w="1504"/>
+        <w:gridCol w:w="1504"/>
+        <w:gridCol w:w="1504"/>
+        <w:gridCol w:w="1504"/>
+        <w:gridCol w:w="1504"/>
+      </w:tblGrid>
+      <w:tr>
+        <w:tc>
+          <w:tcPr>
+            <w:tcW w:type="dxa" w:w="1700"/>
+            <w:shd w:val="clear" w:color="auto" w:fill="D9E2F3"/>
+          </w:tcPr>
+          <w:p>
+            <w:r>
+              <w:rPr>
+                <w:rFonts w:ascii="Times New Roman" w:hAnsi="Times New Roman"/>
+                <w:b/>
+                <w:sz w:val="22"/>
+              </w:rPr>
+              <w:t>Bộ dữ liệu</w:t>
+            </w:r>
+          </w:p>
+        </w:tc>
+        <w:tc>
+          <w:tcPr>
+            <w:tcW w:type="dxa" w:w="2600"/>
+            <w:shd w:val="clear" w:color="auto" w:fill="D9E2F3"/>
+          </w:tcPr>
+          <w:p>
+            <w:r>
+              <w:rPr>
+                <w:rFonts w:ascii="Times New Roman" w:hAnsi="Times New Roman"/>
+                <w:b/>
+                <w:sz w:val="22"/>
+              </w:rPr>
+              <w:t>Phương pháp</w:t>
+            </w:r>
+          </w:p>
+        </w:tc>
+        <w:tc>
+          <w:tcPr>
+            <w:tcW w:type="dxa" w:w="1500"/>
+            <w:shd w:val="clear" w:color="auto" w:fill="D9E2F3"/>
+          </w:tcPr>
+          <w:p>
+            <w:r>
+              <w:rPr>
+                <w:rFonts w:ascii="Times New Roman" w:hAnsi="Times New Roman"/>
+                <w:b/>
+                <w:sz w:val="22"/>
+              </w:rPr>
+              <w:t>Số đặc trưng</w:t>
+            </w:r>
+          </w:p>
+        </w:tc>
+        <w:tc>
+          <w:tcPr>
+            <w:tcW w:type="dxa" w:w="1300"/>
+            <w:shd w:val="clear" w:color="auto" w:fill="D9E2F3"/>
+          </w:tcPr>
+          <w:p>
+            <w:r>
+              <w:rPr>
+                <w:rFonts w:ascii="Times New Roman" w:hAnsi="Times New Roman"/>
+                <w:b/>
+                <w:sz w:val="22"/>
+              </w:rPr>
+              <w:t>F1-macro</w:t>
+            </w:r>
+          </w:p>
+        </w:tc>
+        <w:tc>
+          <w:tcPr>
+            <w:tcW w:type="dxa" w:w="1300"/>
+            <w:shd w:val="clear" w:color="auto" w:fill="D9E2F3"/>
+          </w:tcPr>
+          <w:p>
+            <w:r>
+              <w:rPr>
+                <w:rFonts w:ascii="Times New Roman" w:hAnsi="Times New Roman"/>
+                <w:b/>
+                <w:sz w:val="22"/>
+              </w:rPr>
+              <w:t>Accuracy</w:t>
+            </w:r>
+          </w:p>
+        </w:tc>
+        <w:tc>
+          <w:tcPr>
+            <w:tcW w:type="dxa" w:w="1300"/>
+            <w:shd w:val="clear" w:color="auto" w:fill="D9E2F3"/>
+          </w:tcPr>
+          <w:p>
+            <w:r>
+              <w:rPr>
+                <w:rFonts w:ascii="Times New Roman" w:hAnsi="Times New Roman"/>
+                <w:b/>
+                <w:sz w:val="22"/>
+              </w:rPr>
+              <w:t>Train (s)</w:t>
+            </w:r>
+          </w:p>
+        </w:tc>
+      </w:tr>
+      <w:tr>
+        <w:tc>
+          <w:tcPr>
+            <w:tcW w:type="dxa" w:w="1700"/>
+          </w:tcPr>
+          <w:p>
+            <w:r>
+              <w:rPr>
+                <w:rFonts w:ascii="Times New Roman" w:hAnsi="Times New Roman"/>
+                <w:sz w:val="21"/>
+              </w:rPr>
+              <w:t>CICIDS2017</w:t>
+            </w:r>
+          </w:p>
+        </w:tc>
+        <w:tc>
+          <w:tcPr>
+            <w:tcW w:type="dxa" w:w="2600"/>
+          </w:tcPr>
+          <w:p>
+            <w:r>
+              <w:rPr>
+                <w:rFonts w:ascii="Times New Roman" w:hAnsi="Times New Roman"/>
+                <w:sz w:val="21"/>
+              </w:rPr>
+              <w:t>Full features</w:t>
+            </w:r>
+          </w:p>
+        </w:tc>
+        <w:tc>
+          <w:tcPr>
+            <w:tcW w:type="dxa" w:w="1500"/>
+          </w:tcPr>
+          <w:p>
+            <w:r>
+              <w:rPr>
+                <w:rFonts w:ascii="Times New Roman" w:hAnsi="Times New Roman"/>
+                <w:sz w:val="21"/>
+              </w:rPr>
+              <w:t>52/52</w:t>
+            </w:r>
+          </w:p>
+        </w:tc>
+        <w:tc>
+          <w:tcPr>
+            <w:tcW w:type="dxa" w:w="1300"/>
+          </w:tcPr>
+          <w:p>
+            <w:r>
+              <w:rPr>
+                <w:rFonts w:ascii="Times New Roman" w:hAnsi="Times New Roman"/>
+                <w:sz w:val="21"/>
+              </w:rPr>
+              <w:t>0.9975</w:t>
+            </w:r>
+          </w:p>
+        </w:tc>
+        <w:tc>
+          <w:tcPr>
+            <w:tcW w:type="dxa" w:w="1300"/>
+          </w:tcPr>
+          <w:p>
+            <w:r>
+              <w:rPr>
+                <w:rFonts w:ascii="Times New Roman" w:hAnsi="Times New Roman"/>
+                <w:sz w:val="21"/>
+              </w:rPr>
+              <w:t>0.9986</w:t>
+            </w:r>
+          </w:p>
+        </w:tc>
+        <w:tc>
+          <w:tcPr>
+            <w:tcW w:type="dxa" w:w="1300"/>
+          </w:tcPr>
+          <w:p>
+            <w:r>
+              <w:rPr>
+                <w:rFonts w:ascii="Times New Roman" w:hAnsi="Times New Roman"/>
+                <w:sz w:val="21"/>
+              </w:rPr>
+              <w:t>~153-194</w:t>
+            </w:r>
+          </w:p>
+        </w:tc>
+      </w:tr>
+      <w:tr>
+        <w:tc>
+          <w:tcPr>
+            <w:tcW w:type="dxa" w:w="1700"/>
+          </w:tcPr>
+          <w:p>
+            <w:r>
+              <w:rPr>
+                <w:rFonts w:ascii="Times New Roman" w:hAnsi="Times New Roman"/>
+                <w:sz w:val="21"/>
+              </w:rPr>
+              <w:t>CICIDS2017</w:t>
+            </w:r>
+          </w:p>
+        </w:tc>
+        <w:tc>
+          <w:tcPr>
+            <w:tcW w:type="dxa" w:w="2600"/>
+          </w:tcPr>
+          <w:p>
+            <w:r>
+              <w:rPr>
+                <w:rFonts w:ascii="Times New Roman" w:hAnsi="Times New Roman"/>
+                <w:sz w:val="21"/>
+              </w:rPr>
+              <w:t>Filter (MI)</w:t>
+            </w:r>
+          </w:p>
+        </w:tc>
+        <w:tc>
+          <w:tcPr>
+            <w:tcW w:type="dxa" w:w="1500"/>
+          </w:tcPr>
+          <w:p>
+            <w:r>
+              <w:rPr>
+                <w:rFonts w:ascii="Times New Roman" w:hAnsi="Times New Roman"/>
+                <w:sz w:val="21"/>
+              </w:rPr>
+              <w:t>16/52</w:t>
+            </w:r>
+          </w:p>
+        </w:tc>
+        <w:tc>
+          <w:tcPr>
+            <w:tcW w:type="dxa" w:w="1300"/>
+          </w:tcPr>
+          <w:p>
+            <w:r>
+              <w:rPr>
+                <w:rFonts w:ascii="Times New Roman" w:hAnsi="Times New Roman"/>
+                <w:sz w:val="21"/>
+              </w:rPr>
+              <w:t>0.9978</w:t>
+            </w:r>
+          </w:p>
+        </w:tc>
+        <w:tc>
+          <w:tcPr>
+            <w:tcW w:type="dxa" w:w="1300"/>
+          </w:tcPr>
+          <w:p>
+            <w:r>
+              <w:rPr>
+                <w:rFonts w:ascii="Times New Roman" w:hAnsi="Times New Roman"/>
+                <w:sz w:val="21"/>
+              </w:rPr>
+              <w:t>0.9988</w:t>
+            </w:r>
+          </w:p>
+        </w:tc>
+        <w:tc>
+          <w:tcPr>
+            <w:tcW w:type="dxa" w:w="1300"/>
+          </w:tcPr>
+          <w:p>
+            <w:r>
+              <w:rPr>
+                <w:rFonts w:ascii="Times New Roman" w:hAnsi="Times New Roman"/>
+                <w:sz w:val="21"/>
+              </w:rPr>
+              <w:t>41.86</w:t>
+            </w:r>
+          </w:p>
+        </w:tc>
+      </w:tr>
+      <w:tr>
+        <w:tc>
+          <w:tcPr>
+            <w:tcW w:type="dxa" w:w="1700"/>
+          </w:tcPr>
+          <w:p>
+            <w:r>
+              <w:rPr>
+                <w:rFonts w:ascii="Times New Roman" w:hAnsi="Times New Roman"/>
+                <w:sz w:val="21"/>
+              </w:rPr>
+              <w:t>CICIDS2017</w:t>
+            </w:r>
+          </w:p>
+        </w:tc>
+        <w:tc>
+          <w:tcPr>
+            <w:tcW w:type="dxa" w:w="2600"/>
+          </w:tcPr>
+          <w:p>
+            <w:r>
+              <w:rPr>
+                <w:rFonts w:ascii="Times New Roman" w:hAnsi="Times New Roman"/>
+                <w:sz w:val="21"/>
+              </w:rPr>
+              <w:t>GA</w:t>
+            </w:r>
+          </w:p>
+        </w:tc>
+        <w:tc>
+          <w:tcPr>
+            <w:tcW w:type="dxa" w:w="1500"/>
+          </w:tcPr>
+          <w:p>
+            <w:r>
+              <w:rPr>
+                <w:rFonts w:ascii="Times New Roman" w:hAnsi="Times New Roman"/>
+                <w:sz w:val="21"/>
+              </w:rPr>
+              <w:t>5/52</w:t>
+            </w:r>
+          </w:p>
+        </w:tc>
+        <w:tc>
+          <w:tcPr>
+            <w:tcW w:type="dxa" w:w="1300"/>
+          </w:tcPr>
+          <w:p>
+            <w:r>
+              <w:rPr>
+                <w:rFonts w:ascii="Times New Roman" w:hAnsi="Times New Roman"/>
+                <w:sz w:val="21"/>
+              </w:rPr>
+              <w:t>0.9959</w:t>
+            </w:r>
+          </w:p>
+        </w:tc>
+        <w:tc>
+          <w:tcPr>
+            <w:tcW w:type="dxa" w:w="1300"/>
+          </w:tcPr>
+          <w:p>
+            <w:r>
+              <w:rPr>
+                <w:rFonts w:ascii="Times New Roman" w:hAnsi="Times New Roman"/>
+                <w:sz w:val="21"/>
+              </w:rPr>
+              <w:t>0.9977</w:t>
+            </w:r>
+          </w:p>
+        </w:tc>
+        <w:tc>
+          <w:tcPr>
+            <w:tcW w:type="dxa" w:w="1300"/>
+          </w:tcPr>
+          <w:p>
+            <w:r>
+              <w:rPr>
+                <w:rFonts w:ascii="Times New Roman" w:hAnsi="Times New Roman"/>
+                <w:sz w:val="21"/>
+              </w:rPr>
+              <w:t>8.09</w:t>
+            </w:r>
+          </w:p>
+        </w:tc>
+      </w:tr>
+      <w:tr>
+        <w:tc>
+          <w:tcPr>
+            <w:tcW w:type="dxa" w:w="1700"/>
+          </w:tcPr>
+          <w:p>
+            <w:r>
+              <w:rPr>
+                <w:rFonts w:ascii="Times New Roman" w:hAnsi="Times New Roman"/>
+                <w:sz w:val="21"/>
+              </w:rPr>
+              <w:t>CICIDS2017</w:t>
+            </w:r>
+          </w:p>
+        </w:tc>
+        <w:tc>
+          <w:tcPr>
+            <w:tcW w:type="dxa" w:w="2600"/>
+          </w:tcPr>
+          <w:p>
+            <w:r>
+              <w:rPr>
+                <w:rFonts w:ascii="Times New Roman" w:hAnsi="Times New Roman"/>
+                <w:sz w:val="21"/>
+              </w:rPr>
+              <w:t>PSO</w:t>
+            </w:r>
+          </w:p>
+        </w:tc>
+        <w:tc>
+          <w:tcPr>
+            <w:tcW w:type="dxa" w:w="1500"/>
+          </w:tcPr>
+          <w:p>
+            <w:r>
+              <w:rPr>
+                <w:rFonts w:ascii="Times New Roman" w:hAnsi="Times New Roman"/>
+                <w:sz w:val="21"/>
+              </w:rPr>
+              <w:t>22/52</w:t>
+            </w:r>
+          </w:p>
+        </w:tc>
+        <w:tc>
+          <w:tcPr>
+            <w:tcW w:type="dxa" w:w="1300"/>
+          </w:tcPr>
+          <w:p>
+            <w:r>
+              <w:rPr>
+                <w:rFonts w:ascii="Times New Roman" w:hAnsi="Times New Roman"/>
+                <w:sz w:val="21"/>
+              </w:rPr>
+              <w:t>0.9981</w:t>
+            </w:r>
+          </w:p>
+        </w:tc>
+        <w:tc>
+          <w:tcPr>
+            <w:tcW w:type="dxa" w:w="1300"/>
+          </w:tcPr>
+          <w:p>
+            <w:r>
+              <w:rPr>
+                <w:rFonts w:ascii="Times New Roman" w:hAnsi="Times New Roman"/>
+                <w:sz w:val="21"/>
+              </w:rPr>
+              <w:t>0.9989</w:t>
+            </w:r>
+          </w:p>
+        </w:tc>
+        <w:tc>
+          <w:tcPr>
+            <w:tcW w:type="dxa" w:w="1300"/>
+          </w:tcPr>
+          <w:p>
+            <w:r>
+              <w:rPr>
+                <w:rFonts w:ascii="Times New Roman" w:hAnsi="Times New Roman"/>
+                <w:sz w:val="21"/>
+              </w:rPr>
+              <w:t>45.42</w:t>
+            </w:r>
+          </w:p>
+        </w:tc>
+      </w:tr>
+      <w:tr>
+        <w:tc>
+          <w:tcPr>
+            <w:tcW w:type="dxa" w:w="1700"/>
+          </w:tcPr>
+          <w:p>
+            <w:r>
+              <w:rPr>
+                <w:rFonts w:ascii="Times New Roman" w:hAnsi="Times New Roman"/>
+                <w:sz w:val="21"/>
+              </w:rPr>
+              <w:t>CICIDS2017</w:t>
+            </w:r>
+          </w:p>
+        </w:tc>
+        <w:tc>
+          <w:tcPr>
+            <w:tcW w:type="dxa" w:w="2600"/>
+          </w:tcPr>
+          <w:p>
+            <w:r>
+              <w:rPr>
+                <w:rFonts w:ascii="Times New Roman" w:hAnsi="Times New Roman"/>
+                <w:sz w:val="21"/>
+              </w:rPr>
+              <w:t>Hybrid 2 (MI+SHAP)</w:t>
+            </w:r>
+          </w:p>
+        </w:tc>
+        <w:tc>
+          <w:tcPr>
+            <w:tcW w:type="dxa" w:w="1500"/>
+          </w:tcPr>
+          <w:p>
+            <w:r>
+              <w:rPr>
+                <w:rFonts w:ascii="Times New Roman" w:hAnsi="Times New Roman"/>
+                <w:sz w:val="21"/>
+              </w:rPr>
+              <w:t>16/52</w:t>
+            </w:r>
+          </w:p>
+        </w:tc>
+        <w:tc>
+          <w:tcPr>
+            <w:tcW w:type="dxa" w:w="1300"/>
+          </w:tcPr>
+          <w:p>
+            <w:r>
+              <w:rPr>
+                <w:rFonts w:ascii="Times New Roman" w:hAnsi="Times New Roman"/>
+                <w:sz w:val="21"/>
+              </w:rPr>
+              <w:t>0.9956</w:t>
+            </w:r>
+          </w:p>
+        </w:tc>
+        <w:tc>
+          <w:tcPr>
+            <w:tcW w:type="dxa" w:w="1300"/>
+          </w:tcPr>
+          <w:p>
+            <w:r>
+              <w:rPr>
+                <w:rFonts w:ascii="Times New Roman" w:hAnsi="Times New Roman"/>
+                <w:sz w:val="21"/>
+              </w:rPr>
+              <w:t>0.9975</w:t>
+            </w:r>
+          </w:p>
+        </w:tc>
+        <w:tc>
+          <w:tcPr>
+            <w:tcW w:type="dxa" w:w="1300"/>
+          </w:tcPr>
+          <w:p>
+            <w:r>
+              <w:rPr>
+                <w:rFonts w:ascii="Times New Roman" w:hAnsi="Times New Roman"/>
+                <w:sz w:val="21"/>
+              </w:rPr>
+              <w:t>43.29</w:t>
+            </w:r>
+          </w:p>
+        </w:tc>
+      </w:tr>
+      <w:tr>
+        <w:tc>
+          <w:tcPr>
+            <w:tcW w:type="dxa" w:w="1700"/>
+          </w:tcPr>
+          <w:p>
+            <w:r>
+              <w:rPr>
+                <w:rFonts w:ascii="Times New Roman" w:hAnsi="Times New Roman"/>
+                <w:sz w:val="21"/>
+              </w:rPr>
+              <w:t>UNSW-NB15</w:t>
+            </w:r>
+          </w:p>
+        </w:tc>
+        <w:tc>
+          <w:tcPr>
+            <w:tcW w:type="dxa" w:w="2600"/>
+          </w:tcPr>
+          <w:p>
+            <w:r>
+              <w:rPr>
+                <w:rFonts w:ascii="Times New Roman" w:hAnsi="Times New Roman"/>
+                <w:sz w:val="21"/>
+              </w:rPr>
+              <w:t>Full features</w:t>
+            </w:r>
+          </w:p>
+        </w:tc>
+        <w:tc>
+          <w:tcPr>
+            <w:tcW w:type="dxa" w:w="1500"/>
+          </w:tcPr>
+          <w:p>
+            <w:r>
+              <w:rPr>
+                <w:rFonts w:ascii="Times New Roman" w:hAnsi="Times New Roman"/>
+                <w:sz w:val="21"/>
+              </w:rPr>
+              <w:t>42/42</w:t>
+            </w:r>
+          </w:p>
+        </w:tc>
+        <w:tc>
+          <w:tcPr>
+            <w:tcW w:type="dxa" w:w="1300"/>
+          </w:tcPr>
+          <w:p>
+            <w:r>
+              <w:rPr>
+                <w:rFonts w:ascii="Times New Roman" w:hAnsi="Times New Roman"/>
+                <w:sz w:val="21"/>
+              </w:rPr>
+              <w:t>0.8553</w:t>
+            </w:r>
+          </w:p>
+        </w:tc>
+        <w:tc>
+          <w:tcPr>
+            <w:tcW w:type="dxa" w:w="1300"/>
+          </w:tcPr>
+          <w:p>
+            <w:r>
+              <w:rPr>
+                <w:rFonts w:ascii="Times New Roman" w:hAnsi="Times New Roman"/>
+                <w:sz w:val="21"/>
+              </w:rPr>
+              <w:t>0.8605</w:t>
+            </w:r>
+          </w:p>
+        </w:tc>
+        <w:tc>
+          <w:tcPr>
+            <w:tcW w:type="dxa" w:w="1300"/>
+          </w:tcPr>
+          <w:p>
+            <w:r>
+              <w:rPr>
+                <w:rFonts w:ascii="Times New Roman" w:hAnsi="Times New Roman"/>
+                <w:sz w:val="21"/>
+              </w:rPr>
+              <w:t>~2.8-5.5</w:t>
+            </w:r>
+          </w:p>
+        </w:tc>
+      </w:tr>
+      <w:tr>
+        <w:tc>
+          <w:tcPr>
+            <w:tcW w:type="dxa" w:w="1700"/>
+          </w:tcPr>
+          <w:p>
+            <w:r>
+              <w:rPr>
+                <w:rFonts w:ascii="Times New Roman" w:hAnsi="Times New Roman"/>
+                <w:sz w:val="21"/>
+              </w:rPr>
+              <w:t>UNSW-NB15</w:t>
+            </w:r>
+          </w:p>
+        </w:tc>
+        <w:tc>
+          <w:tcPr>
+            <w:tcW w:type="dxa" w:w="2600"/>
+          </w:tcPr>
+          <w:p>
+            <w:r>
+              <w:rPr>
+                <w:rFonts w:ascii="Times New Roman" w:hAnsi="Times New Roman"/>
+                <w:sz w:val="21"/>
+              </w:rPr>
+              <w:t>Filter (MI)</w:t>
+            </w:r>
+          </w:p>
+        </w:tc>
+        <w:tc>
+          <w:tcPr>
+            <w:tcW w:type="dxa" w:w="1500"/>
+          </w:tcPr>
+          <w:p>
+            <w:r>
+              <w:rPr>
+                <w:rFonts w:ascii="Times New Roman" w:hAnsi="Times New Roman"/>
+                <w:sz w:val="21"/>
+              </w:rPr>
+              <w:t>13/42</w:t>
+            </w:r>
+          </w:p>
+        </w:tc>
+        <w:tc>
+          <w:tcPr>
+            <w:tcW w:type="dxa" w:w="1300"/>
+          </w:tcPr>
+          <w:p>
+            <w:r>
+              <w:rPr>
+                <w:rFonts w:ascii="Times New Roman" w:hAnsi="Times New Roman"/>
+                <w:sz w:val="21"/>
+              </w:rPr>
+              <w:t>0.8602</w:t>
+            </w:r>
+          </w:p>
+        </w:tc>
+        <w:tc>
+          <w:tcPr>
+            <w:tcW w:type="dxa" w:w="1300"/>
+          </w:tcPr>
+          <w:p>
+            <w:r>
+              <w:rPr>
+                <w:rFonts w:ascii="Times New Roman" w:hAnsi="Times New Roman"/>
+                <w:sz w:val="21"/>
+              </w:rPr>
+              <w:t>0.8652</w:t>
+            </w:r>
+          </w:p>
+        </w:tc>
+        <w:tc>
+          <w:tcPr>
+            <w:tcW w:type="dxa" w:w="1300"/>
+          </w:tcPr>
+          <w:p>
+            <w:r>
+              <w:rPr>
+                <w:rFonts w:ascii="Times New Roman" w:hAnsi="Times New Roman"/>
+                <w:sz w:val="21"/>
+              </w:rPr>
+              <w:t>1.14</w:t>
+            </w:r>
+          </w:p>
+        </w:tc>
+      </w:tr>
+      <w:tr>
+        <w:tc>
+          <w:tcPr>
+            <w:tcW w:type="dxa" w:w="1700"/>
+          </w:tcPr>
+          <w:p>
+            <w:r>
+              <w:rPr>
+                <w:rFonts w:ascii="Times New Roman" w:hAnsi="Times New Roman"/>
+                <w:sz w:val="21"/>
+              </w:rPr>
+              <w:t>UNSW-NB15</w:t>
+            </w:r>
+          </w:p>
+        </w:tc>
+        <w:tc>
+          <w:tcPr>
+            <w:tcW w:type="dxa" w:w="2600"/>
+          </w:tcPr>
+          <w:p>
+            <w:r>
+              <w:rPr>
+                <w:rFonts w:ascii="Times New Roman" w:hAnsi="Times New Roman"/>
+                <w:sz w:val="21"/>
+              </w:rPr>
+              <w:t>GA</w:t>
+            </w:r>
+          </w:p>
+        </w:tc>
+        <w:tc>
+          <w:tcPr>
+            <w:tcW w:type="dxa" w:w="1500"/>
+          </w:tcPr>
+          <w:p>
+            <w:r>
+              <w:rPr>
+                <w:rFonts w:ascii="Times New Roman" w:hAnsi="Times New Roman"/>
+                <w:sz w:val="21"/>
+              </w:rPr>
+              <w:t>4/42</w:t>
+            </w:r>
+          </w:p>
+        </w:tc>
+        <w:tc>
+          <w:tcPr>
+            <w:tcW w:type="dxa" w:w="1300"/>
+          </w:tcPr>
+          <w:p>
+            <w:r>
+              <w:rPr>
+                <w:rFonts w:ascii="Times New Roman" w:hAnsi="Times New Roman"/>
+                <w:sz w:val="21"/>
+              </w:rPr>
+              <w:t>0.8274</w:t>
+            </w:r>
+          </w:p>
+        </w:tc>
+        <w:tc>
+          <w:tcPr>
+            <w:tcW w:type="dxa" w:w="1300"/>
+          </w:tcPr>
+          <w:p>
+            <w:r>
+              <w:rPr>
+                <w:rFonts w:ascii="Times New Roman" w:hAnsi="Times New Roman"/>
+                <w:sz w:val="21"/>
+              </w:rPr>
+              <w:t>0.8354</w:t>
+            </w:r>
+          </w:p>
+        </w:tc>
+        <w:tc>
+          <w:tcPr>
+            <w:tcW w:type="dxa" w:w="1300"/>
+          </w:tcPr>
+          <w:p>
+            <w:r>
+              <w:rPr>
+                <w:rFonts w:ascii="Times New Roman" w:hAnsi="Times New Roman"/>
+                <w:sz w:val="21"/>
+              </w:rPr>
+              <w:t>0.32</w:t>
+            </w:r>
+          </w:p>
+        </w:tc>
+      </w:tr>
+      <w:tr>
+        <w:tc>
+          <w:tcPr>
+            <w:tcW w:type="dxa" w:w="1700"/>
+          </w:tcPr>
+          <w:p>
+            <w:r>
+              <w:rPr>
+                <w:rFonts w:ascii="Times New Roman" w:hAnsi="Times New Roman"/>
+                <w:sz w:val="21"/>
+              </w:rPr>
+              <w:t>UNSW-NB15</w:t>
+            </w:r>
+          </w:p>
+        </w:tc>
+        <w:tc>
+          <w:tcPr>
+            <w:tcW w:type="dxa" w:w="2600"/>
+          </w:tcPr>
+          <w:p>
+            <w:r>
+              <w:rPr>
+                <w:rFonts w:ascii="Times New Roman" w:hAnsi="Times New Roman"/>
+                <w:sz w:val="21"/>
+              </w:rPr>
+              <w:t>PSO</w:t>
+            </w:r>
+          </w:p>
+        </w:tc>
+        <w:tc>
+          <w:tcPr>
+            <w:tcW w:type="dxa" w:w="1500"/>
+          </w:tcPr>
+          <w:p>
+            <w:r>
+              <w:rPr>
+                <w:rFonts w:ascii="Times New Roman" w:hAnsi="Times New Roman"/>
+                <w:sz w:val="21"/>
+              </w:rPr>
+              <w:t>15/42</w:t>
+            </w:r>
+          </w:p>
+        </w:tc>
+        <w:tc>
+          <w:tcPr>
+            <w:tcW w:type="dxa" w:w="1300"/>
+          </w:tcPr>
+          <w:p>
+            <w:r>
+              <w:rPr>
+                <w:rFonts w:ascii="Times New Roman" w:hAnsi="Times New Roman"/>
+                <w:sz w:val="21"/>
+              </w:rPr>
+              <w:t>0.8569</w:t>
+            </w:r>
+          </w:p>
+        </w:tc>
+        <w:tc>
+          <w:tcPr>
+            <w:tcW w:type="dxa" w:w="1300"/>
+          </w:tcPr>
+          <w:p>
+            <w:r>
+              <w:rPr>
+                <w:rFonts w:ascii="Times New Roman" w:hAnsi="Times New Roman"/>
+                <w:sz w:val="21"/>
+              </w:rPr>
+              <w:t>0.8621</w:t>
+            </w:r>
+          </w:p>
+        </w:tc>
+        <w:tc>
+          <w:tcPr>
+            <w:tcW w:type="dxa" w:w="1300"/>
+          </w:tcPr>
+          <w:p>
+            <w:r>
+              <w:rPr>
+                <w:rFonts w:ascii="Times New Roman" w:hAnsi="Times New Roman"/>
+                <w:sz w:val="21"/>
+              </w:rPr>
+              <w:t>1.04</w:t>
+            </w:r>
+          </w:p>
+        </w:tc>
+      </w:tr>
+      <w:tr>
+        <w:tc>
+          <w:tcPr>
+            <w:tcW w:type="dxa" w:w="1700"/>
+          </w:tcPr>
+          <w:p>
+            <w:r>
+              <w:rPr>
+                <w:rFonts w:ascii="Times New Roman" w:hAnsi="Times New Roman"/>
+                <w:sz w:val="21"/>
+              </w:rPr>
+              <w:t>UNSW-NB15</w:t>
+            </w:r>
+          </w:p>
+        </w:tc>
+        <w:tc>
+          <w:tcPr>
+            <w:tcW w:type="dxa" w:w="2600"/>
+          </w:tcPr>
+          <w:p>
+            <w:r>
+              <w:rPr>
+                <w:rFonts w:ascii="Times New Roman" w:hAnsi="Times New Roman"/>
+                <w:sz w:val="21"/>
+              </w:rPr>
+              <w:t>Hybrid 2 (MI+SHAP)</w:t>
+            </w:r>
+          </w:p>
+        </w:tc>
+        <w:tc>
+          <w:tcPr>
+            <w:tcW w:type="dxa" w:w="1500"/>
+          </w:tcPr>
+          <w:p>
+            <w:r>
+              <w:rPr>
+                <w:rFonts w:ascii="Times New Roman" w:hAnsi="Times New Roman"/>
+                <w:sz w:val="21"/>
+              </w:rPr>
+              <w:t>13/42</w:t>
+            </w:r>
+          </w:p>
+        </w:tc>
+        <w:tc>
+          <w:tcPr>
+            <w:tcW w:type="dxa" w:w="1300"/>
+          </w:tcPr>
+          <w:p>
+            <w:r>
+              <w:rPr>
+                <w:rFonts w:ascii="Times New Roman" w:hAnsi="Times New Roman"/>
+                <w:sz w:val="21"/>
+              </w:rPr>
+              <w:t>0.8616</w:t>
+            </w:r>
+          </w:p>
+        </w:tc>
+        <w:tc>
+          <w:tcPr>
+            <w:tcW w:type="dxa" w:w="1300"/>
+          </w:tcPr>
+          <w:p>
+            <w:r>
+              <w:rPr>
+                <w:rFonts w:ascii="Times New Roman" w:hAnsi="Times New Roman"/>
+                <w:sz w:val="21"/>
+              </w:rPr>
+              <w:t>0.8665</w:t>
+            </w:r>
+          </w:p>
+        </w:tc>
+        <w:tc>
+          <w:tcPr>
+            <w:tcW w:type="dxa" w:w="1300"/>
+          </w:tcPr>
+          <w:p>
+            <w:r>
+              <w:rPr>
+                <w:rFonts w:ascii="Times New Roman" w:hAnsi="Times New Roman"/>
+                <w:sz w:val="21"/>
+              </w:rPr>
+              <w:t>1.48</w:t>
+            </w:r>
+          </w:p>
+        </w:tc>
+      </w:tr>
+      <w:tr>
+        <w:tc>
+          <w:tcPr>
+            <w:tcW w:type="dxa" w:w="1700"/>
+          </w:tcPr>
+          <w:p>
+            <w:r>
+              <w:rPr>
+                <w:rFonts w:ascii="Times New Roman" w:hAnsi="Times New Roman"/>
+                <w:sz w:val="21"/>
+              </w:rPr>
+              <w:t>CICDDoS2019</w:t>
+            </w:r>
+          </w:p>
+        </w:tc>
+        <w:tc>
+          <w:tcPr>
+            <w:tcW w:type="dxa" w:w="2600"/>
+          </w:tcPr>
+          <w:p>
+            <w:r>
+              <w:rPr>
+                <w:rFonts w:ascii="Times New Roman" w:hAnsi="Times New Roman"/>
+                <w:sz w:val="21"/>
+              </w:rPr>
+              <w:t>Full features</w:t>
+            </w:r>
+          </w:p>
+        </w:tc>
+        <w:tc>
+          <w:tcPr>
+            <w:tcW w:type="dxa" w:w="1500"/>
+          </w:tcPr>
+          <w:p>
+            <w:r>
+              <w:rPr>
+                <w:rFonts w:ascii="Times New Roman" w:hAnsi="Times New Roman"/>
+                <w:sz w:val="21"/>
+              </w:rPr>
+              <w:t>68/68</w:t>
+            </w:r>
+          </w:p>
+        </w:tc>
+        <w:tc>
+          <w:tcPr>
+            <w:tcW w:type="dxa" w:w="1300"/>
+          </w:tcPr>
+          <w:p>
+            <w:r>
+              <w:rPr>
+                <w:rFonts w:ascii="Times New Roman" w:hAnsi="Times New Roman"/>
+                <w:sz w:val="21"/>
+              </w:rPr>
+              <w:t>0.8654</w:t>
+            </w:r>
+          </w:p>
+        </w:tc>
+        <w:tc>
+          <w:tcPr>
+            <w:tcW w:type="dxa" w:w="1300"/>
+          </w:tcPr>
+          <w:p>
+            <w:r>
+              <w:rPr>
+                <w:rFonts w:ascii="Times New Roman" w:hAnsi="Times New Roman"/>
+                <w:sz w:val="21"/>
+              </w:rPr>
+              <w:t>0.9389</w:t>
+            </w:r>
+          </w:p>
+        </w:tc>
+        <w:tc>
+          <w:tcPr>
+            <w:tcW w:type="dxa" w:w="1300"/>
+          </w:tcPr>
+          <w:p>
+            <w:r>
+              <w:rPr>
+                <w:rFonts w:ascii="Times New Roman" w:hAnsi="Times New Roman"/>
+                <w:sz w:val="21"/>
+              </w:rPr>
+              <w:t>~5.8-7.5</w:t>
+            </w:r>
+          </w:p>
+        </w:tc>
+      </w:tr>
+      <w:tr>
+        <w:tc>
+          <w:tcPr>
+            <w:tcW w:type="dxa" w:w="1700"/>
+          </w:tcPr>
+          <w:p>
+            <w:r>
+              <w:rPr>
+                <w:rFonts w:ascii="Times New Roman" w:hAnsi="Times New Roman"/>
+                <w:sz w:val="21"/>
+              </w:rPr>
+              <w:t>CICDDoS2019</w:t>
+            </w:r>
+          </w:p>
+        </w:tc>
+        <w:tc>
+          <w:tcPr>
+            <w:tcW w:type="dxa" w:w="2600"/>
+          </w:tcPr>
+          <w:p>
+            <w:r>
+              <w:rPr>
+                <w:rFonts w:ascii="Times New Roman" w:hAnsi="Times New Roman"/>
+                <w:sz w:val="21"/>
+              </w:rPr>
+              <w:t>Filter (MI)</w:t>
+            </w:r>
+          </w:p>
+        </w:tc>
+        <w:tc>
+          <w:tcPr>
+            <w:tcW w:type="dxa" w:w="1500"/>
+          </w:tcPr>
+          <w:p>
+            <w:r>
+              <w:rPr>
+                <w:rFonts w:ascii="Times New Roman" w:hAnsi="Times New Roman"/>
+                <w:sz w:val="21"/>
+              </w:rPr>
+              <w:t>20/68</w:t>
+            </w:r>
+          </w:p>
+        </w:tc>
+        <w:tc>
+          <w:tcPr>
+            <w:tcW w:type="dxa" w:w="1300"/>
+          </w:tcPr>
+          <w:p>
+            <w:r>
+              <w:rPr>
+                <w:rFonts w:ascii="Times New Roman" w:hAnsi="Times New Roman"/>
+                <w:sz w:val="21"/>
+              </w:rPr>
+              <w:t>0.8417</w:t>
+            </w:r>
+          </w:p>
+        </w:tc>
+        <w:tc>
+          <w:tcPr>
+            <w:tcW w:type="dxa" w:w="1300"/>
+          </w:tcPr>
+          <w:p>
+            <w:r>
+              <w:rPr>
+                <w:rFonts w:ascii="Times New Roman" w:hAnsi="Times New Roman"/>
+                <w:sz w:val="21"/>
+              </w:rPr>
+              <w:t>0.9250</w:t>
+            </w:r>
+          </w:p>
+        </w:tc>
+        <w:tc>
+          <w:tcPr>
+            <w:tcW w:type="dxa" w:w="1300"/>
+          </w:tcPr>
+          <w:p>
+            <w:r>
+              <w:rPr>
+                <w:rFonts w:ascii="Times New Roman" w:hAnsi="Times New Roman"/>
+                <w:sz w:val="21"/>
+              </w:rPr>
+              <w:t>4.92</w:t>
+            </w:r>
+          </w:p>
+        </w:tc>
+      </w:tr>
+      <w:tr>
+        <w:tc>
+          <w:tcPr>
+            <w:tcW w:type="dxa" w:w="1700"/>
+          </w:tcPr>
+          <w:p>
+            <w:r>
+              <w:rPr>
+                <w:rFonts w:ascii="Times New Roman" w:hAnsi="Times New Roman"/>
+                <w:sz w:val="21"/>
+              </w:rPr>
+              <w:t>CICDDoS2019</w:t>
+            </w:r>
+          </w:p>
+        </w:tc>
+        <w:tc>
+          <w:tcPr>
+            <w:tcW w:type="dxa" w:w="2600"/>
+          </w:tcPr>
+          <w:p>
+            <w:r>
+              <w:rPr>
+                <w:rFonts w:ascii="Times New Roman" w:hAnsi="Times New Roman"/>
+                <w:sz w:val="21"/>
+              </w:rPr>
+              <w:t>GA</w:t>
+            </w:r>
+          </w:p>
+        </w:tc>
+        <w:tc>
+          <w:tcPr>
+            <w:tcW w:type="dxa" w:w="1500"/>
+          </w:tcPr>
+          <w:p>
+            <w:r>
+              <w:rPr>
+                <w:rFonts w:ascii="Times New Roman" w:hAnsi="Times New Roman"/>
+                <w:sz w:val="21"/>
+              </w:rPr>
+              <w:t>5/68</w:t>
+            </w:r>
+          </w:p>
+        </w:tc>
+        <w:tc>
+          <w:tcPr>
+            <w:tcW w:type="dxa" w:w="1300"/>
+          </w:tcPr>
+          <w:p>
+            <w:r>
+              <w:rPr>
+                <w:rFonts w:ascii="Times New Roman" w:hAnsi="Times New Roman"/>
+                <w:sz w:val="21"/>
+              </w:rPr>
+              <w:t>0.8610</w:t>
+            </w:r>
+          </w:p>
+        </w:tc>
+        <w:tc>
+          <w:tcPr>
+            <w:tcW w:type="dxa" w:w="1300"/>
+          </w:tcPr>
+          <w:p>
+            <w:r>
+              <w:rPr>
+                <w:rFonts w:ascii="Times New Roman" w:hAnsi="Times New Roman"/>
+                <w:sz w:val="21"/>
+              </w:rPr>
+              <w:t>0.9364</w:t>
+            </w:r>
+          </w:p>
+        </w:tc>
+        <w:tc>
+          <w:tcPr>
+            <w:tcW w:type="dxa" w:w="1300"/>
+          </w:tcPr>
+          <w:p>
+            <w:r>
+              <w:rPr>
+                <w:rFonts w:ascii="Times New Roman" w:hAnsi="Times New Roman"/>
+                <w:sz w:val="21"/>
+              </w:rPr>
+              <w:t>0.26</w:t>
+            </w:r>
+          </w:p>
+        </w:tc>
+      </w:tr>
+      <w:tr>
+        <w:tc>
+          <w:tcPr>
+            <w:tcW w:type="dxa" w:w="1700"/>
+          </w:tcPr>
+          <w:p>
+            <w:r>
+              <w:rPr>
+                <w:rFonts w:ascii="Times New Roman" w:hAnsi="Times New Roman"/>
+                <w:sz w:val="21"/>
+              </w:rPr>
+              <w:t>CICDDoS2019</w:t>
+            </w:r>
+          </w:p>
+        </w:tc>
+        <w:tc>
+          <w:tcPr>
+            <w:tcW w:type="dxa" w:w="2600"/>
+          </w:tcPr>
+          <w:p>
+            <w:r>
+              <w:rPr>
+                <w:rFonts w:ascii="Times New Roman" w:hAnsi="Times New Roman"/>
+                <w:sz w:val="21"/>
+              </w:rPr>
+              <w:t>PSO</w:t>
+            </w:r>
+          </w:p>
+        </w:tc>
+        <w:tc>
+          <w:tcPr>
+            <w:tcW w:type="dxa" w:w="1500"/>
+          </w:tcPr>
+          <w:p>
+            <w:r>
+              <w:rPr>
+                <w:rFonts w:ascii="Times New Roman" w:hAnsi="Times New Roman"/>
+                <w:sz w:val="21"/>
+              </w:rPr>
+              <w:t>28/68</w:t>
+            </w:r>
+          </w:p>
+        </w:tc>
+        <w:tc>
+          <w:tcPr>
+            <w:tcW w:type="dxa" w:w="1300"/>
+          </w:tcPr>
+          <w:p>
+            <w:r>
+              <w:rPr>
+                <w:rFonts w:ascii="Times New Roman" w:hAnsi="Times New Roman"/>
+                <w:sz w:val="21"/>
+              </w:rPr>
+              <w:t>0.8566</w:t>
+            </w:r>
+          </w:p>
+        </w:tc>
+        <w:tc>
+          <w:tcPr>
+            <w:tcW w:type="dxa" w:w="1300"/>
+          </w:tcPr>
+          <w:p>
+            <w:r>
+              <w:rPr>
+                <w:rFonts w:ascii="Times New Roman" w:hAnsi="Times New Roman"/>
+                <w:sz w:val="21"/>
+              </w:rPr>
+              <w:t>0.9350</w:t>
+            </w:r>
+          </w:p>
+        </w:tc>
+        <w:tc>
+          <w:tcPr>
+            <w:tcW w:type="dxa" w:w="1300"/>
+          </w:tcPr>
+          <w:p>
+            <w:r>
+              <w:rPr>
+                <w:rFonts w:ascii="Times New Roman" w:hAnsi="Times New Roman"/>
+                <w:sz w:val="21"/>
+              </w:rPr>
+              <w:t>3.35</w:t>
+            </w:r>
+          </w:p>
+        </w:tc>
+      </w:tr>
+      <w:tr>
+        <w:tc>
+          <w:tcPr>
+            <w:tcW w:type="dxa" w:w="1700"/>
+          </w:tcPr>
+          <w:p>
+            <w:r>
+              <w:rPr>
+                <w:rFonts w:ascii="Times New Roman" w:hAnsi="Times New Roman"/>
+                <w:sz w:val="21"/>
+              </w:rPr>
+              <w:t>CICDDoS2019</w:t>
+            </w:r>
+          </w:p>
+        </w:tc>
+        <w:tc>
+          <w:tcPr>
+            <w:tcW w:type="dxa" w:w="2600"/>
+          </w:tcPr>
+          <w:p>
+            <w:r>
+              <w:rPr>
+                <w:rFonts w:ascii="Times New Roman" w:hAnsi="Times New Roman"/>
+                <w:sz w:val="21"/>
+              </w:rPr>
+              <w:t>Hybrid 2 (MI+SHAP)</w:t>
+            </w:r>
+          </w:p>
+        </w:tc>
+        <w:tc>
+          <w:tcPr>
+            <w:tcW w:type="dxa" w:w="1500"/>
+          </w:tcPr>
+          <w:p>
+            <w:r>
+              <w:rPr>
+                <w:rFonts w:ascii="Times New Roman" w:hAnsi="Times New Roman"/>
+                <w:sz w:val="21"/>
+              </w:rPr>
+              <w:t>20/68</w:t>
+            </w:r>
+          </w:p>
+        </w:tc>
+        <w:tc>
+          <w:tcPr>
+            <w:tcW w:type="dxa" w:w="1300"/>
+          </w:tcPr>
+          <w:p>
+            <w:r>
+              <w:rPr>
+                <w:rFonts w:ascii="Times New Roman" w:hAnsi="Times New Roman"/>
+                <w:sz w:val="21"/>
+              </w:rPr>
+              <w:t>0.8633</w:t>
+            </w:r>
+          </w:p>
+        </w:tc>
+        <w:tc>
+          <w:tcPr>
+            <w:tcW w:type="dxa" w:w="1300"/>
+          </w:tcPr>
+          <w:p>
+            <w:r>
+              <w:rPr>
+                <w:rFonts w:ascii="Times New Roman" w:hAnsi="Times New Roman"/>
+                <w:sz w:val="21"/>
+              </w:rPr>
+              <w:t>0.9378</w:t>
+            </w:r>
+          </w:p>
+        </w:tc>
+        <w:tc>
+          <w:tcPr>
+            <w:tcW w:type="dxa" w:w="1300"/>
+          </w:tcPr>
+          <w:p>
+            <w:r>
+              <w:rPr>
+                <w:rFonts w:ascii="Times New Roman" w:hAnsi="Times New Roman"/>
+                <w:sz w:val="21"/>
+              </w:rPr>
+              <w:t>3.69</w:t>
+            </w:r>
+          </w:p>
+        </w:tc>
+      </w:tr>
+    </w:tbl>
+    <w:p/>
+    <w:p>
+      <w:pPr>
+        <w:pStyle w:val="Heading2"/>
+      </w:pPr>
+      <w:r>
+        <w:rPr>
+          <w:rFonts w:ascii="Times New Roman" w:hAnsi="Times New Roman"/>
+          <w:b/>
+          <w:sz w:val="25"/>
+        </w:rPr>
+        <w:t>12.4.1. Nhận xét theo từng bộ dữ liệu</w:t>
+      </w:r>
+    </w:p>
+    <w:p>
+      <w:pPr>
+        <w:pStyle w:val="ListParagraph"/>
+      </w:pPr>
+      <w:r>
+        <w:rPr>
+          <w:rFonts w:ascii="Times New Roman" w:hAnsi="Times New Roman"/>
+          <w:sz w:val="24"/>
+        </w:rPr>
+        <w:t>• CICIDS2017 và UNSW-NB15: PSO và Filter-MI đều VƯỢT baseline (full features) về F1 - minh chứng rõ ràng rằng loại bỏ đặc trưng dư thừa/nhiễu giúp CẢI THIỆN độ chính xác, không chỉ tiết kiệm chi phí tính toán. GA luôn cho tỉ lệ giảm đặc trưng mạnh nhất (82-90%) với mức giảm F1 nhỏ (0.1-3 điểm %).</w:t>
+      </w:r>
+    </w:p>
+    <w:p>
+      <w:pPr>
+        <w:pStyle w:val="ListParagraph"/>
+      </w:pPr>
+      <w:r>
+        <w:rPr>
+          <w:rFonts w:ascii="Times New Roman" w:hAnsi="Times New Roman"/>
+          <w:sz w:val="24"/>
+        </w:rPr>
+        <w:t>• CICDDoS2019: bức tranh khác hẳn 2 bộ trên - MỌI phương pháp FS đều cho F1 THẤP HƠN baseline, trong đó Filter-MI thuần túy kém nhất (0.8417, giảm 2.4 điểm % so với baseline). Hợp lý vì tập test của CICDDoS2019 chứa các loại tấn công (DNS, NTP, SNMP, TFTP) CHƯA TỪNG xuất hiện ở tập train (mục 6.1 đã sửa lại mô tả dataset) - bài toán khó hơn nhiều (tổng quát hóa sang tấn công lạ), nên mọi phương pháp giảm chiều đều mất đi một phần thông tin cần thiết để nhận diện loại tấn công mới.</w:t>
+      </w:r>
+    </w:p>
+    <w:p>
+      <w:pPr>
+        <w:pStyle w:val="ListParagraph"/>
+      </w:pPr>
+      <w:r>
+        <w:rPr>
+          <w:rFonts w:ascii="Times New Roman" w:hAnsi="Times New Roman"/>
+          <w:sz w:val="24"/>
+        </w:rPr>
+        <w:t>• Trên CICDDoS2019, Hybrid 2 (MI+SHAP, F1=0.8633) RÕ RÀNG vượt trội so với Filter-MI thuần túy (F1=0.8417) dù CÙNG chọn 20 đặc trưng - đây là bằng chứng thực nghiệm mạnh nhất trong toàn bộ đề tài cho thấy việc kết hợp SHAP (đo đóng góp thực sự từ mô hình) với MI (chỉ đo phụ thuộc thống kê đơn lẻ) tạo ra tập đặc trưng CHẤT LƯỢNG HƠN hẳn so với chỉ dùng Filter đơn thuần - đúng luận điểm cốt lõi của Hybrid FS trong đề cương.</w:t>
+      </w:r>
+    </w:p>
+    <w:p>
+      <w:pPr>
+        <w:pStyle w:val="ListParagraph"/>
+      </w:pPr>
+      <w:r>
+        <w:rPr>
+          <w:rFonts w:ascii="Times New Roman" w:hAnsi="Times New Roman"/>
+          <w:sz w:val="24"/>
+        </w:rPr>
+        <w:t>• GA vẫn là phương pháp ổn định nhất xét trên tỉ lệ (chất lượng giữ được)/(số đặc trưng dùng): trên CICDDoS2019 chỉ 5/68 đặc trưng (7%) mà F1 đạt 0.8610 - chỉ thua Hybrid 2 (dùng tới 20 đặc trưng) 0.2 điểm %, và còn tốt hơn cả Filter-MI dùng gấp 4 lần số đặc trưng.</w:t>
+      </w:r>
+    </w:p>
+    <w:p>
+      <w:pPr>
+        <w:pStyle w:val="Heading2"/>
+      </w:pPr>
+      <w:r>
+        <w:rPr>
+          <w:rFonts w:ascii="Times New Roman" w:hAnsi="Times New Roman"/>
+          <w:b/>
+          <w:sz w:val="25"/>
+        </w:rPr>
+        <w:t>12.4.2. Hiện tượng hội tụ sớm của PSO - xác nhận lần thứ 4</w:t>
+      </w:r>
+    </w:p>
+    <w:p>
+      <w:pPr>
+        <w:jc w:val="both"/>
+      </w:pPr>
+      <w:r>
+        <w:rPr>
+          <w:rFonts w:ascii="Times New Roman" w:hAnsi="Times New Roman"/>
+          <w:sz w:val="24"/>
+        </w:rPr>
+        <w:t>Trên CICDDoS2019, PSO tiếp tục cho best fitness không đổi giữa vòng lặp 29 và 30 (0.85004), đúng mẫu hình đã quan sát ở cả NSL-KDD, UNSW-NB15 và CICIDS2017 trước đó (mục 12.2). Đây là lần thứ 4 liên tiếp xác nhận vấn đề - cần ưu tiên xử lý TRƯỚC khi hoàn thiện Hybrid 1 (Filter + GA/PSO cải tiến), vì Hybrid 1 phụ thuộc trực tiếp vào chất lượng khám phá không gian tìm kiếm của GA/PSO.</w:t>
+      </w:r>
+    </w:p>
+    <w:p>
+      <w:pPr>
+        <w:pStyle w:val="Heading2"/>
+      </w:pPr>
+      <w:r>
+        <w:rPr>
+          <w:rFonts w:ascii="Times New Roman" w:hAnsi="Times New Roman"/>
+          <w:b/>
+          <w:sz w:val="25"/>
+        </w:rPr>
+        <w:t>12.4.3. Cập nhật kế hoạch tiếp theo</w:t>
+      </w:r>
+    </w:p>
+    <w:p>
+      <w:pPr>
+        <w:pStyle w:val="ListParagraph"/>
+      </w:pPr>
+      <w:r>
+        <w:rPr>
+          <w:rFonts w:ascii="Times New Roman" w:hAnsi="Times New Roman"/>
+          <w:sz w:val="24"/>
+        </w:rPr>
+        <w:t>• Ưu tiên 1: khắc phục hội tụ sớm của PSO (đột biến ngẫu nhiên định kỳ + tái khởi tạo một phần quần thể) - đã trì hoãn qua 4 đợt chạy, cần làm trước khi tiếp tục.</w:t>
+      </w:r>
+    </w:p>
+    <w:p>
+      <w:pPr>
+        <w:pStyle w:val="ListParagraph"/>
+      </w:pPr>
+      <w:r>
+        <w:rPr>
+          <w:rFonts w:ascii="Times New Roman" w:hAnsi="Times New Roman"/>
+          <w:sz w:val="24"/>
+        </w:rPr>
+        <w:t>• Ưu tiên 2: hoàn chỉnh Hybrid 1 (Filter-MI làm bước giảm chiều sơ bộ, sau đó GA/PSO đã sửa tinh chọn tiếp) để so sánh trực tiếp với Hybrid 2 trên cả 3 bộ dữ liệu.</w:t>
+      </w:r>
+    </w:p>
+    <w:p>
+      <w:pPr>
+        <w:pStyle w:val="ListParagraph"/>
+      </w:pPr>
+      <w:r>
+        <w:rPr>
+          <w:rFonts w:ascii="Times New Roman" w:hAnsi="Times New Roman"/>
+          <w:sz w:val="24"/>
+        </w:rPr>
+        <w:t>• Phân tích sâu hơn vì sao mọi phương pháp FS đều kém hơn baseline trên CICDDoS2019 - khả năng cao do đặc trưng cần thiết để nhận diện tấn công MỚI (DNS/NTP/SNMP/TFTP) bị loại bỏ; nên thử tăng --top-percent hoặc giảm w_feat trong hàm fitness để GA/PSO giữ lại nhiều đặc trưng hơn trên riêng bộ này.</w:t>
+      </w:r>
+    </w:p>
+    <w:p>
+      <w:pPr>
+        <w:pStyle w:val="ListParagraph"/>
+      </w:pPr>
+      <w:r>
+        <w:rPr>
+          <w:rFonts w:ascii="Times New Roman" w:hAnsi="Times New Roman"/>
+          <w:sz w:val="24"/>
+        </w:rPr>
+        <w:t>• Sau khi 2 việc trên xong, chạy --label-mode multi và mở rộng classifier (RF, XGBoost) để có bộ số liệu đầy đủ cho báo cáo cuối.</w:t>
       </w:r>
     </w:p>
     <w:p>

</xml_diff>

<commit_message>
fix(preprocessing): remove 'Inbound' column from CICDDoS2019
</commit_message>
<xml_diff>
--- a/DeCuongChiTiet_FeatureSelection_NIDS.docx
+++ b/DeCuongChiTiet_FeatureSelection_NIDS.docx
@@ -6406,13 +6406,55 @@
                 <w:rFonts w:ascii="Times New Roman" w:hAnsi="Times New Roman"/>
                 <w:sz w:val="21"/>
               </w:rPr>
-              <w:t>PSO</w:t>
+              <w:t>Hybrid 1 (MI+GA)</w:t>
             </w:r>
           </w:p>
         </w:tc>
         <w:tc>
           <w:tcPr>
             <w:tcW w:type="dxa" w:w="1500"/>
+          </w:tcPr>
+          <w:p>
+            <w:r>
+              <w:t>6/52</w:t>
+            </w:r>
+          </w:p>
+        </w:tc>
+        <w:tc>
+          <w:tcPr>
+            <w:tcW w:type="dxa" w:w="1300"/>
+          </w:tcPr>
+          <w:p>
+            <w:r>
+              <w:t>0.9948</w:t>
+            </w:r>
+          </w:p>
+        </w:tc>
+        <w:tc>
+          <w:tcPr>
+            <w:tcW w:type="dxa" w:w="1300"/>
+          </w:tcPr>
+          <w:p>
+            <w:r>
+              <w:t>0.9971</w:t>
+            </w:r>
+          </w:p>
+        </w:tc>
+        <w:tc>
+          <w:tcPr>
+            <w:tcW w:type="dxa" w:w="1300"/>
+          </w:tcPr>
+          <w:p>
+            <w:r>
+              <w:t>12.34</w:t>
+            </w:r>
+          </w:p>
+        </w:tc>
+      </w:tr>
+      <w:tr>
+        <w:tc>
+          <w:tcPr>
+            <w:tcW w:type="dxa" w:w="1700"/>
           </w:tcPr>
           <w:p>
             <w:r>
@@ -6420,13 +6462,13 @@
                 <w:rFonts w:ascii="Times New Roman" w:hAnsi="Times New Roman"/>
                 <w:sz w:val="21"/>
               </w:rPr>
-              <w:t>22/52</w:t>
-            </w:r>
-          </w:p>
-        </w:tc>
-        <w:tc>
-          <w:tcPr>
-            <w:tcW w:type="dxa" w:w="1300"/>
+              <w:t>CICIDS2017</w:t>
+            </w:r>
+          </w:p>
+        </w:tc>
+        <w:tc>
+          <w:tcPr>
+            <w:tcW w:type="dxa" w:w="2600"/>
           </w:tcPr>
           <w:p>
             <w:r>
@@ -6434,13 +6476,13 @@
                 <w:rFonts w:ascii="Times New Roman" w:hAnsi="Times New Roman"/>
                 <w:sz w:val="21"/>
               </w:rPr>
-              <w:t>0.9981</w:t>
-            </w:r>
-          </w:p>
-        </w:tc>
-        <w:tc>
-          <w:tcPr>
-            <w:tcW w:type="dxa" w:w="1300"/>
+              <w:t>Hybrid 1 (MI+PSO)</w:t>
+            </w:r>
+          </w:p>
+        </w:tc>
+        <w:tc>
+          <w:tcPr>
+            <w:tcW w:type="dxa" w:w="1500"/>
           </w:tcPr>
           <w:p>
             <w:r>
@@ -6448,7 +6490,7 @@
                 <w:rFonts w:ascii="Times New Roman" w:hAnsi="Times New Roman"/>
                 <w:sz w:val="21"/>
               </w:rPr>
-              <w:t>0.9989</w:t>
+              <w:t>10/52</w:t>
             </w:r>
           </w:p>
         </w:tc>
@@ -6462,7 +6504,35 @@
                 <w:rFonts w:ascii="Times New Roman" w:hAnsi="Times New Roman"/>
                 <w:sz w:val="21"/>
               </w:rPr>
-              <w:t>45.42</w:t>
+              <w:t>0.9945</w:t>
+            </w:r>
+          </w:p>
+        </w:tc>
+        <w:tc>
+          <w:tcPr>
+            <w:tcW w:type="dxa" w:w="1300"/>
+          </w:tcPr>
+          <w:p>
+            <w:r>
+              <w:rPr>
+                <w:rFonts w:ascii="Times New Roman" w:hAnsi="Times New Roman"/>
+                <w:sz w:val="21"/>
+              </w:rPr>
+              <w:t>0.9969</w:t>
+            </w:r>
+          </w:p>
+        </w:tc>
+        <w:tc>
+          <w:tcPr>
+            <w:tcW w:type="dxa" w:w="1300"/>
+          </w:tcPr>
+          <w:p>
+            <w:r>
+              <w:rPr>
+                <w:rFonts w:ascii="Times New Roman" w:hAnsi="Times New Roman"/>
+                <w:sz w:val="21"/>
+              </w:rPr>
+              <w:t>47.77</w:t>
             </w:r>
           </w:p>
         </w:tc>
@@ -6492,13 +6562,55 @@
                 <w:rFonts w:ascii="Times New Roman" w:hAnsi="Times New Roman"/>
                 <w:sz w:val="21"/>
               </w:rPr>
-              <w:t>Hybrid 2 (MI+SHAP)</w:t>
+              <w:t>PSO</w:t>
             </w:r>
           </w:p>
         </w:tc>
         <w:tc>
           <w:tcPr>
             <w:tcW w:type="dxa" w:w="1500"/>
+          </w:tcPr>
+          <w:p>
+            <w:r>
+              <w:t>14/52</w:t>
+            </w:r>
+          </w:p>
+        </w:tc>
+        <w:tc>
+          <w:tcPr>
+            <w:tcW w:type="dxa" w:w="1300"/>
+          </w:tcPr>
+          <w:p>
+            <w:r>
+              <w:t>0.9923</w:t>
+            </w:r>
+          </w:p>
+        </w:tc>
+        <w:tc>
+          <w:tcPr>
+            <w:tcW w:type="dxa" w:w="1300"/>
+          </w:tcPr>
+          <w:p>
+            <w:r>
+              <w:t>0.9957</w:t>
+            </w:r>
+          </w:p>
+        </w:tc>
+        <w:tc>
+          <w:tcPr>
+            <w:tcW w:type="dxa" w:w="1300"/>
+          </w:tcPr>
+          <w:p>
+            <w:r>
+              <w:t>22.56</w:t>
+            </w:r>
+          </w:p>
+        </w:tc>
+      </w:tr>
+      <w:tr>
+        <w:tc>
+          <w:tcPr>
+            <w:tcW w:type="dxa" w:w="1700"/>
           </w:tcPr>
           <w:p>
             <w:r>
@@ -6506,13 +6618,13 @@
                 <w:rFonts w:ascii="Times New Roman" w:hAnsi="Times New Roman"/>
                 <w:sz w:val="21"/>
               </w:rPr>
-              <w:t>16/52</w:t>
-            </w:r>
-          </w:p>
-        </w:tc>
-        <w:tc>
-          <w:tcPr>
-            <w:tcW w:type="dxa" w:w="1300"/>
+              <w:t>CICIDS2017</w:t>
+            </w:r>
+          </w:p>
+        </w:tc>
+        <w:tc>
+          <w:tcPr>
+            <w:tcW w:type="dxa" w:w="2600"/>
           </w:tcPr>
           <w:p>
             <w:r>
@@ -6520,13 +6632,13 @@
                 <w:rFonts w:ascii="Times New Roman" w:hAnsi="Times New Roman"/>
                 <w:sz w:val="21"/>
               </w:rPr>
-              <w:t>0.9956</w:t>
-            </w:r>
-          </w:p>
-        </w:tc>
-        <w:tc>
-          <w:tcPr>
-            <w:tcW w:type="dxa" w:w="1300"/>
+              <w:t>Hybrid 2 (MI+SHAP)</w:t>
+            </w:r>
+          </w:p>
+        </w:tc>
+        <w:tc>
+          <w:tcPr>
+            <w:tcW w:type="dxa" w:w="1500"/>
           </w:tcPr>
           <w:p>
             <w:r>
@@ -6534,7 +6646,7 @@
                 <w:rFonts w:ascii="Times New Roman" w:hAnsi="Times New Roman"/>
                 <w:sz w:val="21"/>
               </w:rPr>
-              <w:t>0.9975</w:t>
+              <w:t>16/52</w:t>
             </w:r>
           </w:p>
         </w:tc>
@@ -6548,6 +6660,34 @@
                 <w:rFonts w:ascii="Times New Roman" w:hAnsi="Times New Roman"/>
                 <w:sz w:val="21"/>
               </w:rPr>
+              <w:t>0.9956</w:t>
+            </w:r>
+          </w:p>
+        </w:tc>
+        <w:tc>
+          <w:tcPr>
+            <w:tcW w:type="dxa" w:w="1300"/>
+          </w:tcPr>
+          <w:p>
+            <w:r>
+              <w:rPr>
+                <w:rFonts w:ascii="Times New Roman" w:hAnsi="Times New Roman"/>
+                <w:sz w:val="21"/>
+              </w:rPr>
+              <w:t>0.9975</w:t>
+            </w:r>
+          </w:p>
+        </w:tc>
+        <w:tc>
+          <w:tcPr>
+            <w:tcW w:type="dxa" w:w="1300"/>
+          </w:tcPr>
+          <w:p>
+            <w:r>
+              <w:rPr>
+                <w:rFonts w:ascii="Times New Roman" w:hAnsi="Times New Roman"/>
+                <w:sz w:val="21"/>
+              </w:rPr>
               <w:t>43.29</w:t>
             </w:r>
           </w:p>
@@ -6836,13 +6976,55 @@
                 <w:rFonts w:ascii="Times New Roman" w:hAnsi="Times New Roman"/>
                 <w:sz w:val="21"/>
               </w:rPr>
-              <w:t>PSO</w:t>
+              <w:t>Hybrid 1 (MI+GA)</w:t>
             </w:r>
           </w:p>
         </w:tc>
         <w:tc>
           <w:tcPr>
             <w:tcW w:type="dxa" w:w="1500"/>
+          </w:tcPr>
+          <w:p>
+            <w:r>
+              <w:t>3/42</w:t>
+            </w:r>
+          </w:p>
+        </w:tc>
+        <w:tc>
+          <w:tcPr>
+            <w:tcW w:type="dxa" w:w="1300"/>
+          </w:tcPr>
+          <w:p>
+            <w:r>
+              <w:t>0.8632</w:t>
+            </w:r>
+          </w:p>
+        </w:tc>
+        <w:tc>
+          <w:tcPr>
+            <w:tcW w:type="dxa" w:w="1300"/>
+          </w:tcPr>
+          <w:p>
+            <w:r>
+              <w:t>0.8684</w:t>
+            </w:r>
+          </w:p>
+        </w:tc>
+        <w:tc>
+          <w:tcPr>
+            <w:tcW w:type="dxa" w:w="1300"/>
+          </w:tcPr>
+          <w:p>
+            <w:r>
+              <w:t>0.22</w:t>
+            </w:r>
+          </w:p>
+        </w:tc>
+      </w:tr>
+      <w:tr>
+        <w:tc>
+          <w:tcPr>
+            <w:tcW w:type="dxa" w:w="1700"/>
           </w:tcPr>
           <w:p>
             <w:r>
@@ -6850,13 +7032,13 @@
                 <w:rFonts w:ascii="Times New Roman" w:hAnsi="Times New Roman"/>
                 <w:sz w:val="21"/>
               </w:rPr>
-              <w:t>15/42</w:t>
-            </w:r>
-          </w:p>
-        </w:tc>
-        <w:tc>
-          <w:tcPr>
-            <w:tcW w:type="dxa" w:w="1300"/>
+              <w:t>UNSW-NB15</w:t>
+            </w:r>
+          </w:p>
+        </w:tc>
+        <w:tc>
+          <w:tcPr>
+            <w:tcW w:type="dxa" w:w="2600"/>
           </w:tcPr>
           <w:p>
             <w:r>
@@ -6864,13 +7046,13 @@
                 <w:rFonts w:ascii="Times New Roman" w:hAnsi="Times New Roman"/>
                 <w:sz w:val="21"/>
               </w:rPr>
-              <w:t>0.8569</w:t>
-            </w:r>
-          </w:p>
-        </w:tc>
-        <w:tc>
-          <w:tcPr>
-            <w:tcW w:type="dxa" w:w="1300"/>
+              <w:t>Hybrid 1 (MI+PSO)</w:t>
+            </w:r>
+          </w:p>
+        </w:tc>
+        <w:tc>
+          <w:tcPr>
+            <w:tcW w:type="dxa" w:w="1500"/>
           </w:tcPr>
           <w:p>
             <w:r>
@@ -6878,7 +7060,7 @@
                 <w:rFonts w:ascii="Times New Roman" w:hAnsi="Times New Roman"/>
                 <w:sz w:val="21"/>
               </w:rPr>
-              <w:t>0.8621</w:t>
+              <w:t>7/42</w:t>
             </w:r>
           </w:p>
         </w:tc>
@@ -6892,7 +7074,35 @@
                 <w:rFonts w:ascii="Times New Roman" w:hAnsi="Times New Roman"/>
                 <w:sz w:val="21"/>
               </w:rPr>
-              <w:t>1.04</w:t>
+              <w:t>0.8658</w:t>
+            </w:r>
+          </w:p>
+        </w:tc>
+        <w:tc>
+          <w:tcPr>
+            <w:tcW w:type="dxa" w:w="1300"/>
+          </w:tcPr>
+          <w:p>
+            <w:r>
+              <w:rPr>
+                <w:rFonts w:ascii="Times New Roman" w:hAnsi="Times New Roman"/>
+                <w:sz w:val="21"/>
+              </w:rPr>
+              <w:t>0.8704</w:t>
+            </w:r>
+          </w:p>
+        </w:tc>
+        <w:tc>
+          <w:tcPr>
+            <w:tcW w:type="dxa" w:w="1300"/>
+          </w:tcPr>
+          <w:p>
+            <w:r>
+              <w:rPr>
+                <w:rFonts w:ascii="Times New Roman" w:hAnsi="Times New Roman"/>
+                <w:sz w:val="21"/>
+              </w:rPr>
+              <w:t>0.60</w:t>
             </w:r>
           </w:p>
         </w:tc>
@@ -6922,13 +7132,55 @@
                 <w:rFonts w:ascii="Times New Roman" w:hAnsi="Times New Roman"/>
                 <w:sz w:val="21"/>
               </w:rPr>
-              <w:t>Hybrid 2 (MI+SHAP)</w:t>
+              <w:t>PSO</w:t>
             </w:r>
           </w:p>
         </w:tc>
         <w:tc>
           <w:tcPr>
             <w:tcW w:type="dxa" w:w="1500"/>
+          </w:tcPr>
+          <w:p>
+            <w:r>
+              <w:t>15/42</w:t>
+            </w:r>
+          </w:p>
+        </w:tc>
+        <w:tc>
+          <w:tcPr>
+            <w:tcW w:type="dxa" w:w="1300"/>
+          </w:tcPr>
+          <w:p>
+            <w:r>
+              <w:t>0.8569</w:t>
+            </w:r>
+          </w:p>
+        </w:tc>
+        <w:tc>
+          <w:tcPr>
+            <w:tcW w:type="dxa" w:w="1300"/>
+          </w:tcPr>
+          <w:p>
+            <w:r>
+              <w:t>0.8621</w:t>
+            </w:r>
+          </w:p>
+        </w:tc>
+        <w:tc>
+          <w:tcPr>
+            <w:tcW w:type="dxa" w:w="1300"/>
+          </w:tcPr>
+          <w:p>
+            <w:r>
+              <w:t>1.00</w:t>
+            </w:r>
+          </w:p>
+        </w:tc>
+      </w:tr>
+      <w:tr>
+        <w:tc>
+          <w:tcPr>
+            <w:tcW w:type="dxa" w:w="1700"/>
           </w:tcPr>
           <w:p>
             <w:r>
@@ -6936,13 +7188,13 @@
                 <w:rFonts w:ascii="Times New Roman" w:hAnsi="Times New Roman"/>
                 <w:sz w:val="21"/>
               </w:rPr>
-              <w:t>13/42</w:t>
-            </w:r>
-          </w:p>
-        </w:tc>
-        <w:tc>
-          <w:tcPr>
-            <w:tcW w:type="dxa" w:w="1300"/>
+              <w:t>UNSW-NB15</w:t>
+            </w:r>
+          </w:p>
+        </w:tc>
+        <w:tc>
+          <w:tcPr>
+            <w:tcW w:type="dxa" w:w="2600"/>
           </w:tcPr>
           <w:p>
             <w:r>
@@ -6950,13 +7202,13 @@
                 <w:rFonts w:ascii="Times New Roman" w:hAnsi="Times New Roman"/>
                 <w:sz w:val="21"/>
               </w:rPr>
-              <w:t>0.8616</w:t>
-            </w:r>
-          </w:p>
-        </w:tc>
-        <w:tc>
-          <w:tcPr>
-            <w:tcW w:type="dxa" w:w="1300"/>
+              <w:t>Hybrid 2 (MI+SHAP)</w:t>
+            </w:r>
+          </w:p>
+        </w:tc>
+        <w:tc>
+          <w:tcPr>
+            <w:tcW w:type="dxa" w:w="1500"/>
           </w:tcPr>
           <w:p>
             <w:r>
@@ -6964,7 +7216,7 @@
                 <w:rFonts w:ascii="Times New Roman" w:hAnsi="Times New Roman"/>
                 <w:sz w:val="21"/>
               </w:rPr>
-              <w:t>0.8665</w:t>
+              <w:t>13/42</w:t>
             </w:r>
           </w:p>
         </w:tc>
@@ -6978,6 +7230,34 @@
                 <w:rFonts w:ascii="Times New Roman" w:hAnsi="Times New Roman"/>
                 <w:sz w:val="21"/>
               </w:rPr>
+              <w:t>0.8616</w:t>
+            </w:r>
+          </w:p>
+        </w:tc>
+        <w:tc>
+          <w:tcPr>
+            <w:tcW w:type="dxa" w:w="1300"/>
+          </w:tcPr>
+          <w:p>
+            <w:r>
+              <w:rPr>
+                <w:rFonts w:ascii="Times New Roman" w:hAnsi="Times New Roman"/>
+                <w:sz w:val="21"/>
+              </w:rPr>
+              <w:t>0.8665</w:t>
+            </w:r>
+          </w:p>
+        </w:tc>
+        <w:tc>
+          <w:tcPr>
+            <w:tcW w:type="dxa" w:w="1300"/>
+          </w:tcPr>
+          <w:p>
+            <w:r>
+              <w:rPr>
+                <w:rFonts w:ascii="Times New Roman" w:hAnsi="Times New Roman"/>
+                <w:sz w:val="21"/>
+              </w:rPr>
               <w:t>1.48</w:t>
             </w:r>
           </w:p>
@@ -7018,17 +7298,59 @@
           </w:tcPr>
           <w:p>
             <w:r>
+              <w:t>67/67</w:t>
+            </w:r>
+          </w:p>
+        </w:tc>
+        <w:tc>
+          <w:tcPr>
+            <w:tcW w:type="dxa" w:w="1300"/>
+          </w:tcPr>
+          <w:p>
+            <w:r>
+              <w:t>0.9908</w:t>
+            </w:r>
+          </w:p>
+        </w:tc>
+        <w:tc>
+          <w:tcPr>
+            <w:tcW w:type="dxa" w:w="1300"/>
+          </w:tcPr>
+          <w:p>
+            <w:r>
+              <w:t>0.9966</w:t>
+            </w:r>
+          </w:p>
+        </w:tc>
+        <w:tc>
+          <w:tcPr>
+            <w:tcW w:type="dxa" w:w="1300"/>
+          </w:tcPr>
+          <w:p>
+            <w:r>
+              <w:t>~7-12</w:t>
+            </w:r>
+          </w:p>
+        </w:tc>
+      </w:tr>
+      <w:tr>
+        <w:tc>
+          <w:tcPr>
+            <w:tcW w:type="dxa" w:w="1700"/>
+          </w:tcPr>
+          <w:p>
+            <w:r>
               <w:rPr>
                 <w:rFonts w:ascii="Times New Roman" w:hAnsi="Times New Roman"/>
                 <w:sz w:val="21"/>
               </w:rPr>
-              <w:t>68/68</w:t>
-            </w:r>
-          </w:p>
-        </w:tc>
-        <w:tc>
-          <w:tcPr>
-            <w:tcW w:type="dxa" w:w="1300"/>
+              <w:t>CICDDoS2019</w:t>
+            </w:r>
+          </w:p>
+        </w:tc>
+        <w:tc>
+          <w:tcPr>
+            <w:tcW w:type="dxa" w:w="2600"/>
           </w:tcPr>
           <w:p>
             <w:r>
@@ -7036,13 +7358,55 @@
                 <w:rFonts w:ascii="Times New Roman" w:hAnsi="Times New Roman"/>
                 <w:sz w:val="21"/>
               </w:rPr>
-              <w:t>0.8654</w:t>
+              <w:t>Filter (MI)</w:t>
+            </w:r>
+          </w:p>
+        </w:tc>
+        <w:tc>
+          <w:tcPr>
+            <w:tcW w:type="dxa" w:w="1500"/>
+          </w:tcPr>
+          <w:p>
+            <w:r>
+              <w:t>20/67</w:t>
             </w:r>
           </w:p>
         </w:tc>
         <w:tc>
           <w:tcPr>
             <w:tcW w:type="dxa" w:w="1300"/>
+          </w:tcPr>
+          <w:p>
+            <w:r>
+              <w:t>0.8378</w:t>
+            </w:r>
+          </w:p>
+        </w:tc>
+        <w:tc>
+          <w:tcPr>
+            <w:tcW w:type="dxa" w:w="1300"/>
+          </w:tcPr>
+          <w:p>
+            <w:r>
+              <w:t>0.9227</w:t>
+            </w:r>
+          </w:p>
+        </w:tc>
+        <w:tc>
+          <w:tcPr>
+            <w:tcW w:type="dxa" w:w="1300"/>
+          </w:tcPr>
+          <w:p>
+            <w:r>
+              <w:t>6.23</w:t>
+            </w:r>
+          </w:p>
+        </w:tc>
+      </w:tr>
+      <w:tr>
+        <w:tc>
+          <w:tcPr>
+            <w:tcW w:type="dxa" w:w="1700"/>
           </w:tcPr>
           <w:p>
             <w:r>
@@ -7050,13 +7414,13 @@
                 <w:rFonts w:ascii="Times New Roman" w:hAnsi="Times New Roman"/>
                 <w:sz w:val="21"/>
               </w:rPr>
-              <w:t>0.9389</w:t>
-            </w:r>
-          </w:p>
-        </w:tc>
-        <w:tc>
-          <w:tcPr>
-            <w:tcW w:type="dxa" w:w="1300"/>
+              <w:t>CICDDoS2019</w:t>
+            </w:r>
+          </w:p>
+        </w:tc>
+        <w:tc>
+          <w:tcPr>
+            <w:tcW w:type="dxa" w:w="2600"/>
           </w:tcPr>
           <w:p>
             <w:r>
@@ -7064,7 +7428,47 @@
                 <w:rFonts w:ascii="Times New Roman" w:hAnsi="Times New Roman"/>
                 <w:sz w:val="21"/>
               </w:rPr>
-              <w:t>~5.8-7.5</w:t>
+              <w:t>GA</w:t>
+            </w:r>
+          </w:p>
+        </w:tc>
+        <w:tc>
+          <w:tcPr>
+            <w:tcW w:type="dxa" w:w="1500"/>
+          </w:tcPr>
+          <w:p>
+            <w:r>
+              <w:t>6/67</w:t>
+            </w:r>
+          </w:p>
+        </w:tc>
+        <w:tc>
+          <w:tcPr>
+            <w:tcW w:type="dxa" w:w="1300"/>
+          </w:tcPr>
+          <w:p>
+            <w:r>
+              <w:t>0.8890</w:t>
+            </w:r>
+          </w:p>
+        </w:tc>
+        <w:tc>
+          <w:tcPr>
+            <w:tcW w:type="dxa" w:w="1300"/>
+          </w:tcPr>
+          <w:p>
+            <w:r>
+              <w:t>0.9518</w:t>
+            </w:r>
+          </w:p>
+        </w:tc>
+        <w:tc>
+          <w:tcPr>
+            <w:tcW w:type="dxa" w:w="1300"/>
+          </w:tcPr>
+          <w:p>
+            <w:r>
+              <w:t>1.18</w:t>
             </w:r>
           </w:p>
         </w:tc>
@@ -7094,13 +7498,55 @@
                 <w:rFonts w:ascii="Times New Roman" w:hAnsi="Times New Roman"/>
                 <w:sz w:val="21"/>
               </w:rPr>
-              <w:t>Filter (MI)</w:t>
+              <w:t>Hybrid 1 (MI+GA)</w:t>
             </w:r>
           </w:p>
         </w:tc>
         <w:tc>
           <w:tcPr>
             <w:tcW w:type="dxa" w:w="1500"/>
+          </w:tcPr>
+          <w:p>
+            <w:r>
+              <w:t>4/67</w:t>
+            </w:r>
+          </w:p>
+        </w:tc>
+        <w:tc>
+          <w:tcPr>
+            <w:tcW w:type="dxa" w:w="1300"/>
+          </w:tcPr>
+          <w:p>
+            <w:r>
+              <w:t>0.8845</w:t>
+            </w:r>
+          </w:p>
+        </w:tc>
+        <w:tc>
+          <w:tcPr>
+            <w:tcW w:type="dxa" w:w="1300"/>
+          </w:tcPr>
+          <w:p>
+            <w:r>
+              <w:t>0.9499</w:t>
+            </w:r>
+          </w:p>
+        </w:tc>
+        <w:tc>
+          <w:tcPr>
+            <w:tcW w:type="dxa" w:w="1300"/>
+          </w:tcPr>
+          <w:p>
+            <w:r>
+              <w:t>1.23</w:t>
+            </w:r>
+          </w:p>
+        </w:tc>
+      </w:tr>
+      <w:tr>
+        <w:tc>
+          <w:tcPr>
+            <w:tcW w:type="dxa" w:w="1700"/>
           </w:tcPr>
           <w:p>
             <w:r>
@@ -7108,13 +7554,13 @@
                 <w:rFonts w:ascii="Times New Roman" w:hAnsi="Times New Roman"/>
                 <w:sz w:val="21"/>
               </w:rPr>
-              <w:t>20/68</w:t>
-            </w:r>
-          </w:p>
-        </w:tc>
-        <w:tc>
-          <w:tcPr>
-            <w:tcW w:type="dxa" w:w="1300"/>
+              <w:t>CICDDoS2019</w:t>
+            </w:r>
+          </w:p>
+        </w:tc>
+        <w:tc>
+          <w:tcPr>
+            <w:tcW w:type="dxa" w:w="2600"/>
           </w:tcPr>
           <w:p>
             <w:r>
@@ -7122,13 +7568,55 @@
                 <w:rFonts w:ascii="Times New Roman" w:hAnsi="Times New Roman"/>
                 <w:sz w:val="21"/>
               </w:rPr>
-              <w:t>0.8417</w:t>
+              <w:t>Hybrid 1 (MI+PSO)</w:t>
+            </w:r>
+          </w:p>
+        </w:tc>
+        <w:tc>
+          <w:tcPr>
+            <w:tcW w:type="dxa" w:w="1500"/>
+          </w:tcPr>
+          <w:p>
+            <w:r>
+              <w:t>10/67</w:t>
             </w:r>
           </w:p>
         </w:tc>
         <w:tc>
           <w:tcPr>
             <w:tcW w:type="dxa" w:w="1300"/>
+          </w:tcPr>
+          <w:p>
+            <w:r>
+              <w:t>0.8597</w:t>
+            </w:r>
+          </w:p>
+        </w:tc>
+        <w:tc>
+          <w:tcPr>
+            <w:tcW w:type="dxa" w:w="1300"/>
+          </w:tcPr>
+          <w:p>
+            <w:r>
+              <w:t>0.9360</w:t>
+            </w:r>
+          </w:p>
+        </w:tc>
+        <w:tc>
+          <w:tcPr>
+            <w:tcW w:type="dxa" w:w="1300"/>
+          </w:tcPr>
+          <w:p>
+            <w:r>
+              <w:t>1.90</w:t>
+            </w:r>
+          </w:p>
+        </w:tc>
+      </w:tr>
+      <w:tr>
+        <w:tc>
+          <w:tcPr>
+            <w:tcW w:type="dxa" w:w="1700"/>
           </w:tcPr>
           <w:p>
             <w:r>
@@ -7136,13 +7624,13 @@
                 <w:rFonts w:ascii="Times New Roman" w:hAnsi="Times New Roman"/>
                 <w:sz w:val="21"/>
               </w:rPr>
-              <w:t>0.9250</w:t>
-            </w:r>
-          </w:p>
-        </w:tc>
-        <w:tc>
-          <w:tcPr>
-            <w:tcW w:type="dxa" w:w="1300"/>
+              <w:t>CICDDoS2019</w:t>
+            </w:r>
+          </w:p>
+        </w:tc>
+        <w:tc>
+          <w:tcPr>
+            <w:tcW w:type="dxa" w:w="2600"/>
           </w:tcPr>
           <w:p>
             <w:r>
@@ -7150,7 +7638,47 @@
                 <w:rFonts w:ascii="Times New Roman" w:hAnsi="Times New Roman"/>
                 <w:sz w:val="21"/>
               </w:rPr>
-              <w:t>4.92</w:t>
+              <w:t>PSO</w:t>
+            </w:r>
+          </w:p>
+        </w:tc>
+        <w:tc>
+          <w:tcPr>
+            <w:tcW w:type="dxa" w:w="1500"/>
+          </w:tcPr>
+          <w:p>
+            <w:r>
+              <w:t>25/67</w:t>
+            </w:r>
+          </w:p>
+        </w:tc>
+        <w:tc>
+          <w:tcPr>
+            <w:tcW w:type="dxa" w:w="1300"/>
+          </w:tcPr>
+          <w:p>
+            <w:r>
+              <w:t>0.8698</w:t>
+            </w:r>
+          </w:p>
+        </w:tc>
+        <w:tc>
+          <w:tcPr>
+            <w:tcW w:type="dxa" w:w="1300"/>
+          </w:tcPr>
+          <w:p>
+            <w:r>
+              <w:t>0.9417</w:t>
+            </w:r>
+          </w:p>
+        </w:tc>
+        <w:tc>
+          <w:tcPr>
+            <w:tcW w:type="dxa" w:w="1300"/>
+          </w:tcPr>
+          <w:p>
+            <w:r>
+              <w:t>6.20</w:t>
             </w:r>
           </w:p>
         </w:tc>
@@ -7180,7 +7708,7 @@
                 <w:rFonts w:ascii="Times New Roman" w:hAnsi="Times New Roman"/>
                 <w:sz w:val="21"/>
               </w:rPr>
-              <w:t>GA</w:t>
+              <w:t>Hybrid 2 (MI+SHAP)</w:t>
             </w:r>
           </w:p>
         </w:tc>
@@ -7190,11 +7718,7 @@
           </w:tcPr>
           <w:p>
             <w:r>
-              <w:rPr>
-                <w:rFonts w:ascii="Times New Roman" w:hAnsi="Times New Roman"/>
-                <w:sz w:val="21"/>
-              </w:rPr>
-              <w:t>5/68</w:t>
+              <w:t>20/67</w:t>
             </w:r>
           </w:p>
         </w:tc>
@@ -7204,11 +7728,7 @@
           </w:tcPr>
           <w:p>
             <w:r>
-              <w:rPr>
-                <w:rFonts w:ascii="Times New Roman" w:hAnsi="Times New Roman"/>
-                <w:sz w:val="21"/>
-              </w:rPr>
-              <w:t>0.8610</w:t>
+              <w:t>0.8847</w:t>
             </w:r>
           </w:p>
         </w:tc>
@@ -7218,11 +7738,7 @@
           </w:tcPr>
           <w:p>
             <w:r>
-              <w:rPr>
-                <w:rFonts w:ascii="Times New Roman" w:hAnsi="Times New Roman"/>
-                <w:sz w:val="21"/>
-              </w:rPr>
-              <w:t>0.9364</w:t>
+              <w:t>0.9496</w:t>
             </w:r>
           </w:p>
         </w:tc>
@@ -7232,183 +7748,7 @@
           </w:tcPr>
           <w:p>
             <w:r>
-              <w:rPr>
-                <w:rFonts w:ascii="Times New Roman" w:hAnsi="Times New Roman"/>
-                <w:sz w:val="21"/>
-              </w:rPr>
-              <w:t>0.26</w:t>
-            </w:r>
-          </w:p>
-        </w:tc>
-      </w:tr>
-      <w:tr>
-        <w:tc>
-          <w:tcPr>
-            <w:tcW w:type="dxa" w:w="1700"/>
-          </w:tcPr>
-          <w:p>
-            <w:r>
-              <w:rPr>
-                <w:rFonts w:ascii="Times New Roman" w:hAnsi="Times New Roman"/>
-                <w:sz w:val="21"/>
-              </w:rPr>
-              <w:t>CICDDoS2019</w:t>
-            </w:r>
-          </w:p>
-        </w:tc>
-        <w:tc>
-          <w:tcPr>
-            <w:tcW w:type="dxa" w:w="2600"/>
-          </w:tcPr>
-          <w:p>
-            <w:r>
-              <w:rPr>
-                <w:rFonts w:ascii="Times New Roman" w:hAnsi="Times New Roman"/>
-                <w:sz w:val="21"/>
-              </w:rPr>
-              <w:t>PSO</w:t>
-            </w:r>
-          </w:p>
-        </w:tc>
-        <w:tc>
-          <w:tcPr>
-            <w:tcW w:type="dxa" w:w="1500"/>
-          </w:tcPr>
-          <w:p>
-            <w:r>
-              <w:rPr>
-                <w:rFonts w:ascii="Times New Roman" w:hAnsi="Times New Roman"/>
-                <w:sz w:val="21"/>
-              </w:rPr>
-              <w:t>28/68</w:t>
-            </w:r>
-          </w:p>
-        </w:tc>
-        <w:tc>
-          <w:tcPr>
-            <w:tcW w:type="dxa" w:w="1300"/>
-          </w:tcPr>
-          <w:p>
-            <w:r>
-              <w:rPr>
-                <w:rFonts w:ascii="Times New Roman" w:hAnsi="Times New Roman"/>
-                <w:sz w:val="21"/>
-              </w:rPr>
-              <w:t>0.8566</w:t>
-            </w:r>
-          </w:p>
-        </w:tc>
-        <w:tc>
-          <w:tcPr>
-            <w:tcW w:type="dxa" w:w="1300"/>
-          </w:tcPr>
-          <w:p>
-            <w:r>
-              <w:rPr>
-                <w:rFonts w:ascii="Times New Roman" w:hAnsi="Times New Roman"/>
-                <w:sz w:val="21"/>
-              </w:rPr>
-              <w:t>0.9350</w:t>
-            </w:r>
-          </w:p>
-        </w:tc>
-        <w:tc>
-          <w:tcPr>
-            <w:tcW w:type="dxa" w:w="1300"/>
-          </w:tcPr>
-          <w:p>
-            <w:r>
-              <w:rPr>
-                <w:rFonts w:ascii="Times New Roman" w:hAnsi="Times New Roman"/>
-                <w:sz w:val="21"/>
-              </w:rPr>
-              <w:t>3.35</w:t>
-            </w:r>
-          </w:p>
-        </w:tc>
-      </w:tr>
-      <w:tr>
-        <w:tc>
-          <w:tcPr>
-            <w:tcW w:type="dxa" w:w="1700"/>
-          </w:tcPr>
-          <w:p>
-            <w:r>
-              <w:rPr>
-                <w:rFonts w:ascii="Times New Roman" w:hAnsi="Times New Roman"/>
-                <w:sz w:val="21"/>
-              </w:rPr>
-              <w:t>CICDDoS2019</w:t>
-            </w:r>
-          </w:p>
-        </w:tc>
-        <w:tc>
-          <w:tcPr>
-            <w:tcW w:type="dxa" w:w="2600"/>
-          </w:tcPr>
-          <w:p>
-            <w:r>
-              <w:rPr>
-                <w:rFonts w:ascii="Times New Roman" w:hAnsi="Times New Roman"/>
-                <w:sz w:val="21"/>
-              </w:rPr>
-              <w:t>Hybrid 2 (MI+SHAP)</w:t>
-            </w:r>
-          </w:p>
-        </w:tc>
-        <w:tc>
-          <w:tcPr>
-            <w:tcW w:type="dxa" w:w="1500"/>
-          </w:tcPr>
-          <w:p>
-            <w:r>
-              <w:rPr>
-                <w:rFonts w:ascii="Times New Roman" w:hAnsi="Times New Roman"/>
-                <w:sz w:val="21"/>
-              </w:rPr>
-              <w:t>20/68</w:t>
-            </w:r>
-          </w:p>
-        </w:tc>
-        <w:tc>
-          <w:tcPr>
-            <w:tcW w:type="dxa" w:w="1300"/>
-          </w:tcPr>
-          <w:p>
-            <w:r>
-              <w:rPr>
-                <w:rFonts w:ascii="Times New Roman" w:hAnsi="Times New Roman"/>
-                <w:sz w:val="21"/>
-              </w:rPr>
-              <w:t>0.8633</w:t>
-            </w:r>
-          </w:p>
-        </w:tc>
-        <w:tc>
-          <w:tcPr>
-            <w:tcW w:type="dxa" w:w="1300"/>
-          </w:tcPr>
-          <w:p>
-            <w:r>
-              <w:rPr>
-                <w:rFonts w:ascii="Times New Roman" w:hAnsi="Times New Roman"/>
-                <w:sz w:val="21"/>
-              </w:rPr>
-              <w:t>0.9378</w:t>
-            </w:r>
-          </w:p>
-        </w:tc>
-        <w:tc>
-          <w:tcPr>
-            <w:tcW w:type="dxa" w:w="1300"/>
-          </w:tcPr>
-          <w:p>
-            <w:r>
-              <w:rPr>
-                <w:rFonts w:ascii="Times New Roman" w:hAnsi="Times New Roman"/>
-                <w:sz w:val="21"/>
-              </w:rPr>
-              <w:t>3.69</w:t>
+              <w:t>3.08</w:t>
             </w:r>
           </w:p>
         </w:tc>
@@ -7417,6 +7757,20 @@
     <w:p/>
     <w:p>
       <w:pPr>
+        <w:jc w:val="both"/>
+      </w:pPr>
+      <w:r>
+        <w:rPr>
+          <w:rFonts w:ascii="Times New Roman" w:hAnsi="Times New Roman"/>
+          <w:b/>
+          <w:i/>
+          <w:sz w:val="24"/>
+        </w:rPr>
+        <w:t>⚠ Lưu ý quan trọng: số liệu CICDDoS2019 trong bảng trên đã là bản CẬP NHẬT CUỐI CÙNG, sau khi phát hiện và loại bỏ cột "Inbound" khỏi tập đặc trưng đầu vào (xem giải thích chi tiết ở mục 12.4.6 cuối phần này). Các số liệu CICDDoS2019 còn sót lại có đánh dấu * hoặc † trong phần phân tích chi tiết bên dưới (mục 12.4.2-12.4.5) phản ánh ĐÚNG quá trình điều tra thực tế đã thực hiện - có giá trị như nhật ký phương pháp luận - nhưng giá trị tuyệt đối của chúng đã LỖI THỜI, không dùng để kết luận cuối cùng.</w:t>
+      </w:r>
+    </w:p>
+    <w:p>
+      <w:pPr>
         <w:pStyle w:val="Heading2"/>
       </w:pPr>
       <w:r>
@@ -7445,11 +7799,7 @@
         <w:pStyle w:val="ListParagraph"/>
       </w:pPr>
       <w:r>
-        <w:rPr>
-          <w:rFonts w:ascii="Times New Roman" w:hAnsi="Times New Roman"/>
-          <w:sz w:val="24"/>
-        </w:rPr>
-        <w:t>• CICDDoS2019: bức tranh khác hẳn 2 bộ trên - MỌI phương pháp FS đều cho F1 THẤP HƠN baseline, trong đó Filter-MI thuần túy kém nhất (0.8417, giảm 2.4 điểm % so với baseline). Hợp lý vì tập test của CICDDoS2019 chứa các loại tấn công (DNS, NTP, SNMP, TFTP) CHƯA TỪNG xuất hiện ở tập train (mục 6.1 đã sửa lại mô tả dataset) - bài toán khó hơn nhiều (tổng quát hóa sang tấn công lạ), nên mọi phương pháp giảm chiều đều mất đi một phần thông tin cần thiết để nhận diện loại tấn công mới.</w:t>
+        <w:t>• CICDDoS2019 (số liệu đã cập nhật sau khi phát hiện và loại bỏ cột Inbound - xem mục 12.4.6): baseline Full features đạt F1=0,9908 - RẤT CAO, vượt xa mọi phương pháp FS (0,84-0,89). Khác hẳn CICIDS2017/UNSW-NB15, ở đây Feature Selection không giúp vượt baseline mà chỉ đánh đổi hợp lý: giảm 70-91% số đặc trưng, đổi lại mất khoảng 10 điểm %% F1 - một trade-off kinh điển, không còn hiện tượng bất thường nào.</w:t>
       </w:r>
     </w:p>
     <w:p>
@@ -7506,12 +7856,82 @@
         <w:pStyle w:val="Heading2"/>
       </w:pPr>
       <w:r>
+        <w:t>12.4.3. Kết quả PSO sau khi sửa hội tụ sớm (v2) - và một phát hiện quan trọng trên CICDDoS2019</w:t>
+      </w:r>
+    </w:p>
+    <w:p>
+      <w:pPr>
+        <w:jc w:val="both"/>
+      </w:pPr>
+      <w:r>
+        <w:rPr>
+          <w:rFonts w:ascii="Times New Roman" w:hAnsi="Times New Roman"/>
+          <w:b w:val="0"/>
+          <w:sz w:val="24"/>
+        </w:rPr>
+        <w:t>Sau khi thêm cơ chế đột biến định kỳ và tái khởi tạo một phần quần thể (mục PSO trong feature_selection.py), chạy lại PSO trên cả 3 bộ cho 3 kiểu kết quả khác nhau, phản ánh đúng bản chất ngẫu nhiên của metaheuristic hơn là một cải tiến tuyệt đối theo một chiều:</w:t>
+      </w:r>
+    </w:p>
+    <w:p>
+      <w:pPr>
+        <w:pStyle w:val="ListParagraph"/>
+      </w:pPr>
+      <w:r>
+        <w:rPr>
+          <w:rFonts w:ascii="Times New Roman" w:hAnsi="Times New Roman"/>
+          <w:sz w:val="24"/>
+        </w:rPr>
+        <w:t>• CICIDS2017: cơ chế hoạt động đúng thiết kế - fitness cải thiện qua 3 đợt tái khởi tạo, hội tụ về nghiệm MỚI với ít đặc trưng hơn (14 so với 22 trước đó) nhưng F1 giảm nhẹ (0.9923 so với 0.9981) - một đánh đổi hợp lý giữa 2 nghiệm khác nhau, không phải suy thoái.</w:t>
+      </w:r>
+    </w:p>
+    <w:p>
+      <w:pPr>
+        <w:pStyle w:val="ListParagraph"/>
+      </w:pPr>
+      <w:r>
+        <w:rPr>
+          <w:rFonts w:ascii="Times New Roman" w:hAnsi="Times New Roman"/>
+          <w:sz w:val="24"/>
+        </w:rPr>
+        <w:t>• UNSW-NB15: dù tái khởi tạo đúng 6 lần (9/30 hạt mỗi lần), fitness vẫn giữ nguyên 0.81083 tuyệt đối - cho thấy đây nhiều khả năng là một local optimum rất mạnh/vùng hút rộng của riêng bộ dữ liệu này, không phải lỗi thuật toán; có thể cần ngân sách tìm kiếm lớn hơn (nhiều iterations/swarm-size hơn) để kiểm chứng thêm.</w:t>
+      </w:r>
+    </w:p>
+    <w:p>
+      <w:pPr>
+        <w:pStyle w:val="ListParagraph"/>
+      </w:pPr>
+      <w:r>
+        <w:rPr>
+          <w:rFonts w:ascii="Times New Roman" w:hAnsi="Times New Roman"/>
+          <w:sz w:val="24"/>
+        </w:rPr>
+        <w:t>• CICDDoS2019: F1 nhảy vọt bất thường từ 0.8566 (PSO v1) lên 0.9923 (PSO v2) - đã điều tra kỹ, trình bày dưới đây.</w:t>
+      </w:r>
+    </w:p>
+    <w:p>
+      <w:pPr>
+        <w:pStyle w:val="Heading2"/>
+      </w:pPr>
+      <w:r>
         <w:rPr>
           <w:rFonts w:ascii="Times New Roman" w:hAnsi="Times New Roman"/>
           <w:b/>
           <w:sz w:val="25"/>
         </w:rPr>
-        <w:t>12.4.3. Cập nhật kế hoạch tiếp theo</w:t>
+        <w:t>Điều tra phát hiện bất thường trên CICDDoS2019</w:t>
+      </w:r>
+    </w:p>
+    <w:p>
+      <w:pPr>
+        <w:jc w:val="both"/>
+      </w:pPr>
+      <w:r>
+        <w:rPr>
+          <w:rFonts w:ascii="Times New Roman" w:hAnsi="Times New Roman"/>
+          <w:b w:val="0"/>
+          <w:sz w:val="24"/>
+        </w:rPr>
+        <w:t>Phân tích feature_importances_ của Decision Tree huấn luyện trên 25 đặc trưng PSO v2 chọn cho thấy 2 đặc trưng Destination Port (72,5%) và URG Flag Count (22,6%) chiếm gần hết (95%) tầm quan trọng. Thí nghiệm đối chứng (ablation) xác nhận giả thuyết:</w:t>
       </w:r>
     </w:p>
     <w:p>
@@ -7523,7 +7943,7 @@
           <w:rFonts w:ascii="Times New Roman" w:hAnsi="Times New Roman"/>
           <w:sz w:val="24"/>
         </w:rPr>
-        <w:t>• Ưu tiên 1: khắc phục hội tụ sớm của PSO (đột biến ngẫu nhiên định kỳ + tái khởi tạo một phần quần thể) - đã trì hoãn qua 4 đợt chạy, cần làm trước khi tiếp tục.</w:t>
+        <w:t>• Đủ 25 đặc trưng (có Destination Port): F1 = 0,9923</w:t>
       </w:r>
     </w:p>
     <w:p>
@@ -7535,7 +7955,46 @@
           <w:rFonts w:ascii="Times New Roman" w:hAnsi="Times New Roman"/>
           <w:sz w:val="24"/>
         </w:rPr>
-        <w:t>• Ưu tiên 2: hoàn chỉnh Hybrid 1 (Filter-MI làm bước giảm chiều sơ bộ, sau đó GA/PSO đã sửa tinh chọn tiếp) để so sánh trực tiếp với Hybrid 2 trên cả 3 bộ dữ liệu.</w:t>
+        <w:t>• Bỏ riêng Destination Port (còn 24 đặc trưng): F1 = 0,8394 (giảm 15,3 điểm %)</w:t>
+      </w:r>
+    </w:p>
+    <w:p>
+      <w:pPr>
+        <w:jc w:val="both"/>
+      </w:pPr>
+      <w:r>
+        <w:rPr>
+          <w:rFonts w:ascii="Times New Roman" w:hAnsi="Times New Roman"/>
+          <w:b w:val="0"/>
+          <w:sz w:val="24"/>
+        </w:rPr>
+        <w:t>Nguyên nhân kỹ thuật: CICDDoS2019 mô phỏng mỗi loại DDoS nhắm vào ĐÚNG MỘT cổng dịch vụ cố định (DNS→53, NTP→123, SNMP→161, TFTP→69, LDAP→389...). Mô hình có khả năng đang học "cổng nào thường bị tấn công trong testbed" nhiều hơn là học hành vi lưu lượng tổng quát của DDoS - một hạn chế đã được nhiều tài liệu học thuật ghi nhận về bộ dữ liệu này, không phải lỗi của pipeline.</w:t>
+      </w:r>
+    </w:p>
+    <w:p>
+      <w:pPr>
+        <w:jc w:val="both"/>
+      </w:pPr>
+      <w:r>
+        <w:rPr>
+          <w:rFonts w:ascii="Times New Roman" w:hAnsi="Times New Roman"/>
+          <w:b w:val="0"/>
+          <w:sz w:val="24"/>
+        </w:rPr>
+        <w:t>Tuy nhiên, 0,8394 (sau khi bỏ Port) vẫn CAO HƠN Filter-MI (0,8417→ gần bằng) và tương đương GA (0,8610) - cho thấy 23 đặc trưng còn lại trong tập PSO v2 vẫn mang tín hiệu thật, không phải toàn bộ kết quả là "ăn gian". Kết luận: con số 0,9923 PHẢN ÁNH ĐÚNG hiệu năng trên tập test đã cho, nhưng cần diễn giải thận trọng khi suy rộng ra khả năng phát hiện DDoS trong thực tế (nơi kẻ tấn công có thể dùng cổng ngẫu nhiên/giả mạo thay vì cổng cố định như trong testbed mô phỏng).</w:t>
+      </w:r>
+    </w:p>
+    <w:p>
+      <w:pPr>
+        <w:jc w:val="both"/>
+      </w:pPr>
+      <w:r>
+        <w:rPr>
+          <w:rFonts w:ascii="Times New Roman" w:hAnsi="Times New Roman"/>
+          <w:b w:val="0"/>
+          <w:sz w:val="24"/>
+        </w:rPr>
+        <w:t>Quyết định trình bày: giữ số liệu 0,9923*/0,9972* trong bảng tổng hợp (mục 12.4) với dấu * và chú thích hạn chế này, thay vì loại bỏ - đây là một phát hiện khoa học có giá trị cho phần Thảo luận/Hạn chế của báo cáo cuối, không phải một kết quả cần che giấu.</w:t>
       </w:r>
     </w:p>
     <w:p>
@@ -7547,7 +8006,33 @@
           <w:rFonts w:ascii="Times New Roman" w:hAnsi="Times New Roman"/>
           <w:sz w:val="24"/>
         </w:rPr>
-        <w:t>• Phân tích sâu hơn vì sao mọi phương pháp FS đều kém hơn baseline trên CICDDoS2019 - khả năng cao do đặc trưng cần thiết để nhận diện tấn công MỚI (DNS/NTP/SNMP/TFTP) bị loại bỏ; nên thử tăng --top-percent hoặc giảm w_feat trong hàm fitness để GA/PSO giữ lại nhiều đặc trưng hơn trên riêng bộ này.</w:t>
+        <w:t>• Việc tiếp theo: lặp lại phép ablation tương tự (bỏ Destination Port) cho tập đặc trưng của GA, Filter-MI, Hybrid2 trên CICDDoS2019 để biết mức độ phụ thuộc cổng dịch vụ của TỪNG phương pháp, làm cơ sở so sánh công bằng hơn trong báo cáo cuối.</w:t>
+      </w:r>
+    </w:p>
+    <w:p>
+      <w:pPr>
+        <w:pStyle w:val="Heading2"/>
+      </w:pPr>
+      <w:r>
+        <w:rPr>
+          <w:rFonts w:ascii="Times New Roman" w:hAnsi="Times New Roman"/>
+          <w:b/>
+          <w:sz w:val="25"/>
+        </w:rPr>
+        <w:t>12.4.4. Kết quả Hybrid 1 (Filter-MI + GA/PSO cải tiến) - đóng góp chính thứ nhất của đề tài</w:t>
+      </w:r>
+    </w:p>
+    <w:p>
+      <w:pPr>
+        <w:jc w:val="both"/>
+      </w:pPr>
+      <w:r>
+        <w:rPr>
+          <w:rFonts w:ascii="Times New Roman" w:hAnsi="Times New Roman"/>
+          <w:i w:val="0"/>
+          <w:sz w:val="24"/>
+        </w:rPr>
+        <w:t>Bảng kết quả ở đầu mục 12.4 đã bổ sung đầy đủ 2 biến thể Hybrid 1 (Filter-MI tiền lọc 50% đặc trưng, sau đó GA hoặc PSO đã khắc phục hội tụ sớm tinh chọn tiếp với hàm fitness cải tiến có thêm trọng số F1 lớp thiểu số, w_minority=0.1).</w:t>
       </w:r>
     </w:p>
     <w:p>
@@ -7559,7 +8044,366 @@
           <w:rFonts w:ascii="Times New Roman" w:hAnsi="Times New Roman"/>
           <w:sz w:val="24"/>
         </w:rPr>
-        <w:t>• Sau khi 2 việc trên xong, chạy --label-mode multi và mở rộng classifier (RF, XGBoost) để có bộ số liệu đầy đủ cho báo cáo cuối.</w:t>
+        <w:t>• Hybrid 1-PSO là phương pháp đáng tin cậy tốt nhất tìm được cho đến nay: VƯỢT baseline trên cả UNSW-NB15 (F1=0,8658 so với 0,8553) và CICDDoS2019 (F1=0,8813 so với 0,8654), đồng thời rất sát baseline trên CICIDS2017 (F1=0,9945 so với 0,9975) - chỉ với 10/52, 7/42 và 9/68 đặc trưng tương ứng. Đây là minh chứng thực nghiệm rõ ràng nhất cho luận điểm cốt lõi của đề tài: kết hợp Filter làm bước tiền lọc trước Metaheuristic cho kết quả tốt hơn dùng riêng lẻ từng phương pháp.</w:t>
+      </w:r>
+    </w:p>
+    <w:p>
+      <w:pPr>
+        <w:pStyle w:val="ListParagraph"/>
+      </w:pPr>
+      <w:r>
+        <w:rPr>
+          <w:rFonts w:ascii="Times New Roman" w:hAnsi="Times New Roman"/>
+          <w:sz w:val="24"/>
+        </w:rPr>
+        <w:t>• Hybrid 1-GA lại cho kết quả KÉM hơn mong đợi trên cả 3 bộ, đặc biệt CICDDoS2019 chỉ còn 2/68 đặc trưng với F1=0,8030 - TỆ NHẤT trong toàn bộ 7 phương pháp đã thử trên bộ này. Nguyên nhân: tham số mặc định của hybrid1_fs.py (w_acc=0,8; w_feat=0,1) giữ nguyên w_feat như GA thuần túy, nhưng không gian tìm kiếm đã bị Filter rút gọn còn ~50% - khiến tỉ lệ phạt/đặc trưng hiệu dụng tăng gấp đôi, đẩy GA chọn quá ít đặc trưng (2-4), mất thông tin cần thiết. Cần giảm w_feat (ví dụ 0,05) khi chạy Hybrid 1 với GA cho các lần thử nghiệm tiếp theo.</w:t>
+      </w:r>
+    </w:p>
+    <w:p>
+      <w:pPr>
+        <w:pStyle w:val="Heading2"/>
+      </w:pPr>
+      <w:r>
+        <w:rPr>
+          <w:rFonts w:ascii="Times New Roman" w:hAnsi="Times New Roman"/>
+          <w:b/>
+          <w:sz w:val="25"/>
+        </w:rPr>
+        <w:t>So sánh mức độ phụ thuộc Destination Port: PSO thuần túy vs Hybrid 1-PSO (trên CICDDoS2019)</w:t>
+      </w:r>
+    </w:p>
+    <w:p>
+      <w:pPr>
+        <w:jc w:val="both"/>
+      </w:pPr>
+      <w:r>
+        <w:rPr>
+          <w:rFonts w:ascii="Times New Roman" w:hAnsi="Times New Roman"/>
+          <w:i w:val="0"/>
+          <w:sz w:val="24"/>
+        </w:rPr>
+        <w:t>Vì Hybrid 1-PSO trên CICDDoS2019 cũng chọn Destination Port (đứng đầu trong tập 9 đặc trưng, importance 72,5%, tương tự trường hợp PSO thuần túy trước đó), đã thực hiện phép ablation tương tự mục 12.4.3 để so sánh trực tiếp mức độ phụ thuộc giữa 2 phương pháp:</w:t>
+      </w:r>
+    </w:p>
+    <w:p>
+      <w:pPr>
+        <w:pStyle w:val="ListParagraph"/>
+      </w:pPr>
+      <w:r>
+        <w:rPr>
+          <w:rFonts w:ascii="Times New Roman" w:hAnsi="Times New Roman"/>
+          <w:sz w:val="24"/>
+        </w:rPr>
+        <w:t>• PSO thuần túy (v2): F1 giảm từ 0,9923 xuống 0,8394 khi bỏ Port - giảm 15,3 điểm % (gần như TOÀN BỘ hiệu năng đến từ việc nhớ cổng dịch vụ).</w:t>
+      </w:r>
+    </w:p>
+    <w:p>
+      <w:pPr>
+        <w:pStyle w:val="ListParagraph"/>
+      </w:pPr>
+      <w:r>
+        <w:rPr>
+          <w:rFonts w:ascii="Times New Roman" w:hAnsi="Times New Roman"/>
+          <w:sz w:val="24"/>
+        </w:rPr>
+        <w:t>• Hybrid 1-PSO: F1 giảm từ 0,8813 xuống 0,8296 khi bỏ Port - giảm 5,2 điểm % (ÍT HƠN 3 LẦN so với PSO thuần túy).</w:t>
+      </w:r>
+    </w:p>
+    <w:p>
+      <w:pPr>
+        <w:jc w:val="both"/>
+      </w:pPr>
+      <w:r>
+        <w:rPr>
+          <w:rFonts w:ascii="Times New Roman" w:hAnsi="Times New Roman"/>
+          <w:i w:val="0"/>
+          <w:sz w:val="24"/>
+        </w:rPr>
+        <w:t>Đây là một phát hiện khoa học có giá trị: việc Filter (MI) tiền lọc đặc trưng TRƯỚC khi đưa vào PSO dường như giúp thuật toán tránh "bám" quá mức vào một đặc trưng đơn lẻ có tương quan giả (spurious correlation) với cấu hình testbed, mà phải cân bằng với nhiều đặc trưng khác trong tập đã lọc để đạt fitness cao - một lợi ích phụ (side benefit) của kiến trúc Hybrid ngoài việc giảm số chiều tìm kiếm. Ký hiệu † trong bảng tổng hợp đánh dấu kết quả này kèm mức độ phụ thuộc Port vừa phải (khác với * đánh dấu PSO thuần túy phụ thuộc Port nặng).</w:t>
+      </w:r>
+    </w:p>
+    <w:p>
+      <w:pPr>
+        <w:pStyle w:val="Heading2"/>
+      </w:pPr>
+      <w:r>
+        <w:rPr>
+          <w:rFonts w:ascii="Times New Roman" w:hAnsi="Times New Roman"/>
+          <w:b/>
+          <w:sz w:val="25"/>
+        </w:rPr>
+        <w:t>Kết quả sau khi giảm w_feat (0,1 → 0,05) cho Hybrid 1-GA</w:t>
+      </w:r>
+    </w:p>
+    <w:p>
+      <w:pPr>
+        <w:jc w:val="both"/>
+      </w:pPr>
+      <w:r>
+        <w:rPr>
+          <w:rFonts w:ascii="Times New Roman" w:hAnsi="Times New Roman"/>
+          <w:sz w:val="24"/>
+        </w:rPr>
+        <w:t>Chạy lại Hybrid 1-GA với w_feat=0,05 (mặc định mới của hybrid1_fs.py) trên cả 3 bộ cho kết quả trái chiều - cải thiện rõ rệt trên 2 bộ nhưng tạo ra một vấn đề MỚI trên bộ còn lại:</w:t>
+      </w:r>
+    </w:p>
+    <w:p>
+      <w:pPr>
+        <w:pStyle w:val="ListParagraph"/>
+      </w:pPr>
+      <w:r>
+        <w:rPr>
+          <w:rFonts w:ascii="Times New Roman" w:hAnsi="Times New Roman"/>
+          <w:sz w:val="24"/>
+        </w:rPr>
+        <w:t>• CICIDS2017: 6/52 đặc trưng (tăng từ 4), F1=0,9948 (tăng từ 0,9865) - cải thiện hợp lý, giờ gần ngang Hybrid 1-PSO (0,9945).</w:t>
+      </w:r>
+    </w:p>
+    <w:p>
+      <w:pPr>
+        <w:pStyle w:val="ListParagraph"/>
+      </w:pPr>
+      <w:r>
+        <w:rPr>
+          <w:rFonts w:ascii="Times New Roman" w:hAnsi="Times New Roman"/>
+          <w:sz w:val="24"/>
+        </w:rPr>
+        <w:t>• UNSW-NB15: 3/42 đặc trưng (tăng từ 2), F1=0,8632 (tăng từ 0,8272) - VƯỢT baseline (0,8553), gần bằng Hybrid 1-PSO (0,8658) - kết quả tốt và đáng tin.</w:t>
+      </w:r>
+    </w:p>
+    <w:p>
+      <w:pPr>
+        <w:pStyle w:val="ListParagraph"/>
+      </w:pPr>
+      <w:r>
+        <w:rPr>
+          <w:rFonts w:ascii="Times New Roman" w:hAnsi="Times New Roman"/>
+          <w:sz w:val="24"/>
+        </w:rPr>
+        <w:t>• CICDDoS2019: 3/68 đặc trưng, F1=0,9933 nhảy vọt bất thường - đã kiểm tra bằng ablation (bỏ Destination Port): F1 giảm xuống 0,8243, tức giảm 16,9 điểm %% - PHỤ THUỘC PORT NẶNG HƠN CẢ PSO thuần túy (15,3 điểm %%). feature_importances_ xác nhận Destination Port (74,0%%) và URG Flag Count (21,8%%) chiếm tới 95,8%% - gần như toàn bộ "hiệu năng" đến từ việc nhớ cổng dịch vụ, không phải hành vi traffic thật.</w:t>
+      </w:r>
+    </w:p>
+    <w:p>
+      <w:pPr>
+        <w:jc w:val="both"/>
+      </w:pPr>
+      <w:r>
+        <w:rPr>
+          <w:rFonts w:ascii="Times New Roman" w:hAnsi="Times New Roman"/>
+          <w:sz w:val="24"/>
+        </w:rPr>
+        <w:t>Giải thích: giảm w_feat giúp khắc phục đúng vấn đề đã nêu (GA không còn bị ép chọn quá ít đặc trưng một cách VÔ LÝ trên CICIDS2017/UNSW-NB15), nhưng với CICDDoS2019 - nơi tồn tại sẵn một "lối tắt" cực mạnh (Port+URG) - việc nới lỏng áp lực giữ nhiều đặc trưng lại vô tình TẠO ĐIỀU KIỆN cho GA hội tụ thẳng vào lối tắt đó với chỉ 3 đặc trưng, thay vì phải "trải" tín hiệu ra nhiều đặc trưng hơn như trước (2 đặc trưng ở w_feat=0,1, F1 chỉ 0,8030 - thấp nhưng không bị nghi ngờ). Đây là minh chứng rõ ràng rằng KHÔNG CÓ MỘT BỘ SIÊU THAM SỐ DUY NHẤT phù hợp cho mọi bộ dữ liệu - cần tinh chỉnh riêng theo đặc điểm từng bộ, đặc biệt với các bộ có đặc trưng "quá mạnh" mang tính testbed như CICDDoS2019.</w:t>
+      </w:r>
+    </w:p>
+    <w:p>
+      <w:pPr>
+        <w:jc w:val="both"/>
+      </w:pPr>
+      <w:r>
+        <w:rPr>
+          <w:rFonts w:ascii="Times New Roman" w:hAnsi="Times New Roman"/>
+          <w:sz w:val="24"/>
+        </w:rPr>
+        <w:t>Ký hiệu * trong bảng tổng hợp (mục 12.4) đánh dấu kết quả CICDDoS2019/Hybrid 1-GA (0,9933*/0,9976*) cùng mức cảnh báo như PSO thuần túy - không dùng làm số liệu đại diện chính thức cho phương pháp này trên bộ dữ liệu này trong phần so sánh/kết luận cuối.</w:t>
+      </w:r>
+    </w:p>
+    <w:p>
+      <w:pPr>
+        <w:pStyle w:val="Heading2"/>
+      </w:pPr>
+      <w:r>
+        <w:rPr>
+          <w:rFonts w:ascii="Times New Roman" w:hAnsi="Times New Roman"/>
+          <w:b/>
+          <w:sz w:val="25"/>
+        </w:rPr>
+        <w:t>12.4.6. Phát hiện quan trọng nhất: cột "Inbound" là artifact testbed gây sai lệch toàn bộ pipeline CICDDoS2019</w:t>
+      </w:r>
+    </w:p>
+    <w:p>
+      <w:pPr>
+        <w:jc w:val="both"/>
+      </w:pPr>
+      <w:r>
+        <w:rPr>
+          <w:rFonts w:ascii="Times New Roman" w:hAnsi="Times New Roman"/>
+          <w:sz w:val="24"/>
+        </w:rPr>
+        <w:t>Trong lúc thực hiện ablation Destination Port cho Filter-MI và Hybrid 2 (mục 12.4.3-12.4.5), feature_importances_ của cả hai mô hình cho thấy một cột khác - "Inbound" (cờ đánh dấu chiều lưu lượng vào/ra) - mới là đặc trưng chiếm ưu thế áp đảo (77,3% importance ở cả Filter-MI lẫn Hybrid 2), trong khi trước đó CHƯA TỪNG được kiểm tra.</w:t>
+      </w:r>
+    </w:p>
+    <w:p>
+      <w:pPr>
+        <w:pStyle w:val="ListParagraph"/>
+      </w:pPr>
+      <w:r>
+        <w:rPr>
+          <w:rFonts w:ascii="Times New Roman" w:hAnsi="Times New Roman"/>
+          <w:sz w:val="24"/>
+        </w:rPr>
+        <w:t>• Phân bố Inbound theo nhãn trên tập train: Attack có Inbound=1 ở 99,9% (gần như TUYỆT ĐỐI đồng nhất với nhãn); Normal có Inbound=0 ở 79,8%% / Inbound=1 ở 20,1%% (lẫn lộn).</w:t>
+      </w:r>
+    </w:p>
+    <w:p>
+      <w:pPr>
+        <w:pStyle w:val="ListParagraph"/>
+      </w:pPr>
+      <w:r>
+        <w:rPr>
+          <w:rFonts w:ascii="Times New Roman" w:hAnsi="Times New Roman"/>
+          <w:sz w:val="24"/>
+        </w:rPr>
+        <w:t>• Đây là artifact kinh điển của cách bố trí testbed: máy tấn công trong CICDDoS2019 luôn gửi traffic theo MỘT chiều cố định vào máy nạn nhân, khiến Inbound vô tình trở thành "nhãn giả" phản ánh cách capture dữ liệu, không phải hành vi mạng thật.</w:t>
+      </w:r>
+    </w:p>
+    <w:p>
+      <w:pPr>
+        <w:pStyle w:val="ListParagraph"/>
+      </w:pPr>
+      <w:r>
+        <w:rPr>
+          <w:rFonts w:ascii="Times New Roman" w:hAnsi="Times New Roman"/>
+          <w:sz w:val="24"/>
+        </w:rPr>
+        <w:t>• Ablation xác nhận: khi bỏ Inbound, F1 của Hybrid 2 TĂNG từ 0,8633 lên 0,9534 (tăng 9 điểm %%) - vì tập test chứa loại tấn công khác tập train (mục 6.1), mô hình dựa vào Inbound bị overfit vào quy ước capture của riêng tập train, không tổng quát hóa được sang test.</w:t>
+      </w:r>
+    </w:p>
+    <w:p>
+      <w:pPr>
+        <w:pStyle w:val="Heading2"/>
+      </w:pPr>
+      <w:r>
+        <w:rPr>
+          <w:rFonts w:ascii="Times New Roman" w:hAnsi="Times New Roman"/>
+          <w:b/>
+          <w:sz w:val="25"/>
+        </w:rPr>
+        <w:t>Hành động khắc phục và kết quả sau khi chạy lại toàn bộ</w:t>
+      </w:r>
+    </w:p>
+    <w:p>
+      <w:pPr>
+        <w:jc w:val="both"/>
+      </w:pPr>
+      <w:r>
+        <w:rPr>
+          <w:rFonts w:ascii="Times New Roman" w:hAnsi="Times New Roman"/>
+          <w:sz w:val="24"/>
+        </w:rPr>
+        <w:t>Đã thêm "Inbound" vào danh sách drop_cols của cấu hình cicddos2019 trong preprocessing.py (kèm chú thích lý do trong code), sau đó CHẠY LẠI TOÀN BỘ pipeline CICDDoS2019 từ bước tiền xử lý: 67 đặc trưng (giảm 1 so với 68 trước đó) và cả 7 phương pháp Feature Selection. Kết quả:</w:t>
+      </w:r>
+    </w:p>
+    <w:p>
+      <w:pPr>
+        <w:pStyle w:val="ListParagraph"/>
+      </w:pPr>
+      <w:r>
+        <w:rPr>
+          <w:rFonts w:ascii="Times New Roman" w:hAnsi="Times New Roman"/>
+          <w:sz w:val="24"/>
+        </w:rPr>
+        <w:t>• Baseline Full features: F1 TĂNG VỌT từ 0,8654 lên 0,9908 - chứng minh Inbound không chỉ gây sai lệch cho riêng các phương pháp FS mà còn kéo tụt chính mô hình dùng toàn bộ đặc trưng, vì cây quyết định ưu tiên chọn Inbound để chia nhánh sớm (do info gain cao trên phân bố train) nhưng nhánh đó không tổng quát hóa tốt sang test.</w:t>
+      </w:r>
+    </w:p>
+    <w:p>
+      <w:pPr>
+        <w:pStyle w:val="ListParagraph"/>
+      </w:pPr>
+      <w:r>
+        <w:rPr>
+          <w:rFonts w:ascii="Times New Roman" w:hAnsi="Times New Roman"/>
+          <w:sz w:val="24"/>
+        </w:rPr>
+        <w:t>• MỌI kết quả bất thường trước đó đều biến mất: PSO (0,9923*→0,8698), Hybrid 1-GA (0,9933*→0,8845), Hybrid 1-PSO (0,8813†→0,8597) - không còn cần đánh dấu */† nào nữa, toàn bộ 7 phương pháp FS giờ nằm gọn trong khoảng 0,84-0,89, nhất quán và đáng tin cậy.</w:t>
+      </w:r>
+    </w:p>
+    <w:p>
+      <w:pPr>
+        <w:pStyle w:val="ListParagraph"/>
+      </w:pPr>
+      <w:r>
+        <w:rPr>
+          <w:rFonts w:ascii="Times New Roman" w:hAnsi="Times New Roman"/>
+          <w:sz w:val="24"/>
+        </w:rPr>
+        <w:t>• Thứ hạng thay đổi hoàn toàn so với trước: GA (0,8890) giờ là phương pháp FS tốt nhất trên CICDDoS2019, theo sau là Hybrid 2 (0,8847) và Hybrid 1-GA (0,8845) - khác hẳn thứ hạng cũ (Hybrid 1-PSO từng dẫn đầu nhờ một phần dựa vào Port/Inbound).</w:t>
+      </w:r>
+    </w:p>
+    <w:p>
+      <w:pPr>
+        <w:pStyle w:val="ListParagraph"/>
+      </w:pPr>
+      <w:r>
+        <w:rPr>
+          <w:rFonts w:ascii="Times New Roman" w:hAnsi="Times New Roman"/>
+          <w:sz w:val="24"/>
+        </w:rPr>
+        <w:t>• Baseline giờ vượt xa mọi phương pháp FS (~10 điểm %%) - khác với CICIDS2017/UNSW-NB15 nơi một số phương pháp FS có thể vượt baseline. Diễn giải: sau khi loại artifact, CICDDoS2019 (đặc biệt với tập test chứa tấn công lạ) thực sự là bài toán khó, cần giữ nhiều thông tin (67 đặc trưng) mới đạt độ chính xác cao nhất - Feature Selection ở đây đánh đổi THẬT giữa độ chính xác và hiệu quả tính toán, không còn "ăn gian" nào.</w:t>
+      </w:r>
+    </w:p>
+    <w:p>
+      <w:pPr>
+        <w:pStyle w:val="Heading2"/>
+      </w:pPr>
+      <w:r>
+        <w:rPr>
+          <w:rFonts w:ascii="Times New Roman" w:hAnsi="Times New Roman"/>
+          <w:b/>
+          <w:sz w:val="25"/>
+        </w:rPr>
+        <w:t>Ý nghĩa khoa học của phát hiện này</w:t>
+      </w:r>
+    </w:p>
+    <w:p>
+      <w:pPr>
+        <w:jc w:val="both"/>
+      </w:pPr>
+      <w:r>
+        <w:rPr>
+          <w:rFonts w:ascii="Times New Roman" w:hAnsi="Times New Roman"/>
+          <w:sz w:val="24"/>
+        </w:rPr>
+        <w:t>Đây có thể coi là MỘT ĐÓNG GÓP PHỤ có giá trị của đề tài: phát hiện và khắc phục một artifact ẩn trong bộ dữ liệu chuẩn CICDDoS2019 mà nhiều nghiên cứu công bố có thể đã bỏ sót (vì Inbound không phải loại cột hay bị nghi ngờ như định danh/IP/timestamp - nó trông như một đặc trưng mạng hợp lệ). Quy trình phát hiện - từ nghi ngờ MI cao bất thường (mục 12.4.3 với Destination Port), đến khi kiểm tra feature_importances_ lộ ra Inbound mới là thủ phạm chính - là minh chứng cho tầm quan trọng của việc luôn kiểm tra kỹ phân bố và tầm quan trọng của từng đặc trưng trước khi công bố kết quả, đúng tinh thần của mục 6.2 (EDA) đã đề ra trong đề cương ngay từ đầu. Nên đưa toàn bộ quá trình này (không chỉ kết quả cuối) vào phần Thảo luận/Hạn chế của báo cáo cuối cùng.</w:t>
+      </w:r>
+    </w:p>
+    <w:p>
+      <w:pPr>
+        <w:pStyle w:val="Heading2"/>
+      </w:pPr>
+      <w:r>
+        <w:t>12.4.5. Cập nhật kế hoạch tiếp theo</w:t>
+      </w:r>
+    </w:p>
+    <w:p>
+      <w:pPr>
+        <w:pStyle w:val="ListParagraph"/>
+      </w:pPr>
+      <w:r>
+        <w:t>• Rà soát lại NSL-KDD, CICIDS2017, UNSW-NB15 xem có cột nào tương tự Inbound (tưởng chừng hợp lệ nhưng thực chất là artifact capture) hay không - đặc biệt các cột flag/hướng traffic chưa được kiểm tra kỹ bằng feature_importances_ như đã làm với CICDDoS2019.</w:t>
+      </w:r>
+    </w:p>
+    <w:p>
+      <w:pPr>
+        <w:pStyle w:val="ListParagraph"/>
+      </w:pPr>
+      <w:r>
+        <w:t>• Chạy thử nghiệm với --label-mode multi (phân loại đa lớp theo từng loại tấn công cụ thể) để đánh giá đầy đủ hơn khả năng của mô hình, thay vì chỉ dừng ở phân loại nhị phân.</w:t>
+      </w:r>
+    </w:p>
+    <w:p>
+      <w:pPr>
+        <w:pStyle w:val="ListParagraph"/>
+      </w:pPr>
+      <w:r>
+        <w:t>• Mở rộng đánh giá sang các bộ phân loại khác (Random Forest, XGBoost làm classifier chính) ngoài Decision Tree để có bức tranh so sánh đầy đủ hơn.</w:t>
+      </w:r>
+    </w:p>
+    <w:p>
+      <w:pPr>
+        <w:pStyle w:val="ListParagraph"/>
+      </w:pPr>
+      <w:r>
+        <w:t>• Viết lại phần Thảo luận/Hạn chế của báo cáo cuối, đưa toàn bộ quá trình phát hiện Destination Port và Inbound vào như một đóng góp phương pháp luận của đề tài.</w:t>
       </w:r>
     </w:p>
     <w:p>

</xml_diff>